<commit_message>
Add option translate terminal log
</commit_message>
<xml_diff>
--- a/Home.th.docx
+++ b/Home.th.docx
@@ -68,7 +68,7 @@
           <w:sz w:val="19"/>
           <w:szCs w:val="19"/>
         </w:rPr>
-        <w:t>กำหนดมาตรฐาน · ออกแบบ ·ฐานข้อมูล · ระบบสื่อสาร · firmware · ความปลอดภัย · การควบคุมการเปลี่ยนแปลง</w:t>
+        <w:t>ความต้องการ · ออกแบบ ·ฐานข้อมูล · สัญญาณส่งผ่าน · Firmware · ความปลอดภัย · การดำเนินงาน</w:t>
       </w:r>
     </w:p>
     <w:p>
@@ -90,7 +90,7 @@
           <w:sz w:val="20"/>
           <w:szCs w:val="20"/>
         </w:rPr>
-        <w:t>พร้อมตามหลักเกณฑ์ของ IEEE/ISO/IEC/IEEE 29148:2018</w:t>
+        <w:t>เตรียมพร้อมตามมาตรฐาน IEEE/ISO/IEC/IEEE 29148:2018</w:t>
       </w:r>
     </w:p>
     <w:tbl>
@@ -159,7 +159,7 @@
                 <w:sz w:val="19"/>
                 <w:szCs w:val="19"/>
               </w:rPr>
-              <w:t>แพลตฟอร์มการควบคุมอัตโนมัติบ้าน — ส่วนประกอบซอฟต์แวร์ออกแบบ</w:t>
+              <w:t>แพลตฟอร์มควบคุมบ้าน — วัตถุประสงค์การออกแบบแพ็คเกจซอฟต์แวร์</w:t>
             </w:r>
           </w:p>
         </w:tc>
@@ -306,7 +306,7 @@
                 <w:sz w:val="19"/>
                 <w:szCs w:val="19"/>
               </w:rPr>
-              <w:t>ยอมรับสำหรับการพัฒนา</w:t>
+              <w:t>ได้รับการตั้งค่าสำหรับการพัฒนา</w:t>
             </w:r>
           </w:p>
         </w:tc>
@@ -384,7 +384,7 @@
                 <w:sz w:val="19"/>
                 <w:szCs w:val="19"/>
               </w:rPr>
-              <w:t>ประเภท</w:t>
+              <w:t>ประเภทการรักษาความลับ</w:t>
             </w:r>
           </w:p>
         </w:tc>
@@ -404,7 +404,7 @@
                 <w:sz w:val="19"/>
                 <w:szCs w:val="19"/>
               </w:rPr>
-              <w:t>ลับ</w:t>
+              <w:t>ความลับ</w:t>
             </w:r>
           </w:p>
         </w:tc>
@@ -453,7 +453,7 @@
                 <w:sz w:val="19"/>
                 <w:szCs w:val="19"/>
               </w:rPr>
-              <w:t>ทีมการออกแบบ / การสร้างแพลตฟอร์ม</w:t>
+              <w:t>ทีมงานด้านการออกแบบ / การสร้างแพลตฟอร์ม</w:t>
             </w:r>
           </w:p>
         </w:tc>
@@ -472,7 +472,7 @@
           <w:sz w:val="16"/>
           <w:szCs w:val="16"/>
         </w:rPr>
-        <w:t>ลับ — สำหรับการใช้งานภายในงานวิศวกรรมและผู้มีส่วนได้ส่วนเสียเท่านั้น</w:t>
+        <w:t>ลับ — สำหรับการใช้งานภายในวิศวกรและผู้มีส่วนได้ส่วนเสียเท่านั้น</w:t>
       </w:r>
     </w:p>
     <w:p>
@@ -706,7 +706,7 @@
                 <w:sz w:val="18"/>
                 <w:szCs w:val="18"/>
               </w:rPr>
-              <w:t>ร่างต้นฉบับที่ได้รับมาจาก SRS แหล่งกำเนิด</w:t>
+              <w:t>ร่างโครงสร้างเริ่มต้นจาก SRS ที่มีแหล่งกำเนิด</w:t>
             </w:r>
           </w:p>
         </w:tc>
@@ -792,7 +792,7 @@
                 <w:sz w:val="18"/>
                 <w:szCs w:val="18"/>
               </w:rPr>
-              <w:t>เพิ่ม章ต่างๆ เกี่ยวกับสถาปัตยกรรม,ฐานข้อมูล, MQTT และ API</w:t>
+              <w:t>เพิ่ม章เรื่องสถาปัตยกรรม,ฐานข้อมูล, MQTT และ API</w:t>
             </w:r>
           </w:p>
         </w:tc>
@@ -878,7 +878,7 @@
                 <w:sz w:val="18"/>
                 <w:szCs w:val="18"/>
               </w:rPr>
-              <w:t>บทความเกี่ยวกับ firmware, ความปลอดภัย, การติดตั้งและทดสอบ; การตรวจสอบภายใน</w:t>
+              <w:t>บทเรียนเกี่ยวกับ firmware, ความปลอดภัย, การติดตั้งและทดสอบ;การตรวจสอบภายใน</w:t>
             </w:r>
           </w:p>
         </w:tc>
@@ -964,7 +964,7 @@
                 <w:sz w:val="18"/>
                 <w:szCs w:val="18"/>
               </w:rPr>
-              <w:t>ตั้งเป็นฐานสำหรับการพัฒนา. คำแนะนำในบทความได้รับการรวมอยู่แล้ว</w:t>
+              <w:t>ตั้งเป็นฐานสำหรับการพัฒนา. คำแนะนำการตรวจสอบรวมเข้าไปแล้ว</w:t>
             </w:r>
           </w:p>
         </w:tc>
@@ -991,7 +991,7 @@
         <w:jc w:val="both"/>
       </w:pPr>
       <w:r>
-        <w:t>เอกสารนี้ต้องได้รับการลงนามจากผู้มีส่วนได้ส่วนเสียที่กำหนดก่อนจะนำมาควบคุมการเปลี่ยนแปลง การเปลี่ยนแปลงต่อเนื่องจะต้องเสนอผ่านกระบวนการขอการเปลี่ยนแปลงที่ระบุไว้ในแผนการพัฒนาโครงการ</w:t>
+        <w:t>เอกสารนี้ต้องได้รับการลงนามจากผู้มีส่วนได้ส่วนเสียที่กำหนดก่อนจะนำมาควบคุมการเปลี่ยนแปลง การเปลี่ยนแปลงที่ตามมาจะต้องขึ้นอยู่กับกระบวนการขอการเปลี่ยนแปลงที่ระบุไว้ในบทความแผนพัฒนาในการพัฒนาของเรา</w:t>
       </w:r>
       <w:proofErr w:type="gramStart"/>
       <w:r/>
@@ -1117,7 +1117,7 @@
                 <w:sz w:val="18"/>
                 <w:szCs w:val="18"/>
               </w:rPr>
-              <w:t>เครื่องหมาย / วันที่</w:t>
+              <w:t>เซลฟี / วันที่</w:t>
             </w:r>
           </w:p>
         </w:tc>
@@ -1140,7 +1140,7 @@
                 <w:sz w:val="18"/>
                 <w:szCs w:val="18"/>
               </w:rPr>
-              <w:t>ผู้ดูแลผลิตภัณฑ์</w:t>
+              <w:t>ผู้จัดการผลิตภัณฑ์</w:t>
             </w:r>
           </w:p>
         </w:tc>
@@ -1182,7 +1182,7 @@
                 <w:sz w:val="18"/>
                 <w:szCs w:val="18"/>
               </w:rPr>
-              <w:t>วงจรและความสำคัญ</w:t>
+              <w:t>สิ่งกำหนดนโยบายและความสำคัญ</w:t>
             </w:r>
           </w:p>
         </w:tc>
@@ -1226,7 +1226,7 @@
                 <w:sz w:val="18"/>
                 <w:szCs w:val="18"/>
               </w:rPr>
-              <w:t>ผู้นำสถาปัตยกรรม</w:t>
+              <w:t>สถาปนิกนำทีม</w:t>
             </w:r>
           </w:p>
         </w:tc>
@@ -1268,7 +1268,7 @@
                 <w:sz w:val="18"/>
                 <w:szCs w:val="18"/>
               </w:rPr>
-              <w:t>ความเหมาะสมทางเทคนิค</w:t>
+              <w:t>ความถูกต้องทางเทคนิค</w:t>
             </w:r>
           </w:p>
         </w:tc>
@@ -1312,7 +1312,7 @@
                 <w:sz w:val="18"/>
                 <w:szCs w:val="18"/>
               </w:rPr>
-              <w:t>ผู้นำหลังฝั่งเบคเอนด์</w:t>
+              <w:t>ผู้นำด้านเบื้องหลัง</w:t>
             </w:r>
           </w:p>
         </w:tc>
@@ -1398,7 +1398,7 @@
                 <w:sz w:val="18"/>
                 <w:szCs w:val="18"/>
               </w:rPr>
-              <w:t>ผู้นำ firmware</w:t>
+              <w:t>ผู้นำด้าน firmware</w:t>
             </w:r>
           </w:p>
         </w:tc>
@@ -1886,7 +1886,7 @@
                 <w:sz w:val="18"/>
                 <w:szCs w:val="18"/>
               </w:rPr>
-              <w:t>ประเด็นเกี่ยวกับการออกแบบและการพัฒนาระบบ.</w:t>
+              <w:t>ประเด็นในการออกแบบและการพัฒนาระบบ.</w:t>
             </w:r>
           </w:p>
         </w:tc>
@@ -1951,7 +1951,7 @@
                 <w:sz w:val="18"/>
                 <w:szCs w:val="18"/>
               </w:rPr>
-              <w:t>การอธิบายและข้อกำหนดสำหรับระบบ.</w:t>
+              <w:t>การอธิบายการออกแบบ.</w:t>
             </w:r>
           </w:p>
         </w:tc>
@@ -2017,7 +2017,7 @@
                 <w:sz w:val="18"/>
                 <w:szCs w:val="18"/>
               </w:rPr>
-              <w:t>มาตรฐาน OpenAPI Specification 3.1</w:t>
+              <w:t>มาตรฐานการเขียน API OpenAPI Specification 3.1</w:t>
             </w:r>
           </w:p>
         </w:tc>
@@ -2038,7 +2038,7 @@
                 <w:sz w:val="18"/>
                 <w:szCs w:val="18"/>
               </w:rPr>
-              <w:t>รูปแบบติดต่อ API ของ REST.</w:t>
+              <w:t>รูปแบบติดต่อข้อมูล REST API</w:t>
             </w:r>
           </w:p>
         </w:tc>
@@ -2103,7 +2103,7 @@
                 <w:sz w:val="18"/>
                 <w:szCs w:val="18"/>
               </w:rPr>
-              <w:t>ข้อกำหนดการส่งข้อความ.</w:t>
+              <w:t>มาตรฐานการส่งข้อความ.</w:t>
             </w:r>
           </w:p>
         </w:tc>
@@ -2473,7 +2473,7 @@
                 <w:rStyle w:val="Hyperlink"/>
                 <w:noProof/>
               </w:rPr>
-              <w:t>1  วิธีการกำหนดมาตรฐานซอฟต์แวร์</w:t>
+              <w:t>1  การกำหนดมาตรฐานความต้องการของซอฟต์แวร์</w:t>
             </w:r>
             <w:r>
               <w:rPr>
@@ -2656,7 +2656,7 @@
                 <w:rStyle w:val="Hyperlink"/>
                 <w:noProof/>
               </w:rPr>
-              <w:t>1.3  การมองเห็นผลิตภัณฑ์</w:t>
+              <w:t>1.3  การนำเสนอผลิตภัณฑ์</w:t>
             </w:r>
             <w:r>
               <w:rPr>
@@ -2717,7 +2717,7 @@
                 <w:rStyle w:val="Hyperlink"/>
                 <w:noProof/>
               </w:rPr>
-              <w:t>1.3.1  การมองเห็นผลิตภัณฑ์จากมุมมองของผู้ใช้</w:t>
+              <w:t>1.3.1  มุมมองของผลิตภัณฑ์</w:t>
             </w:r>
             <w:r>
               <w:rPr>
@@ -2778,7 +2778,7 @@
                 <w:rStyle w:val="Hyperlink"/>
                 <w:noProof/>
               </w:rPr>
-              <w:t>1.3.2  ประวัติการทำงานของผลิตภัณฑ์ (สรุป)</w:t>
+              <w:t>1.3.2  การดำเนินการผลิตภัณฑ์ (สรุป)</w:t>
             </w:r>
             <w:r>
               <w:rPr>
@@ -2961,7 +2961,7 @@
                 <w:rStyle w:val="Hyperlink"/>
                 <w:noProof/>
               </w:rPr>
-              <w:t>1.3.5  ข้อจำกัดในการออกแบบและการติดตั้ง</w:t>
+              <w:t>1.3.5  การออกแบบและการดำเนินการข้อจำกัด</w:t>
             </w:r>
             <w:r>
               <w:rPr>
@@ -3022,7 +3022,7 @@
                 <w:rStyle w:val="Hyperlink"/>
                 <w:noProof/>
               </w:rPr>
-              <w:t>1.3.6  การยอมรับและขึ้นอยู่กับข้อมูล</w:t>
+              <w:t>1.3.6  ความเชื่อมโยงและความตั้งใจ</w:t>
             </w:r>
             <w:r>
               <w:rPr>
@@ -3083,7 +3083,7 @@
                 <w:rStyle w:val="Hyperlink"/>
                 <w:noProof/>
               </w:rPr>
-              <w:t>1.4  คำจำกัดความ อักขระ และอักษรที่ย่อ</w:t>
+              <w:t>1.4  คำจำกัดความ อักขระ และอักษรย่อ</w:t>
             </w:r>
             <w:r>
               <w:rPr>
@@ -3144,7 +3144,7 @@
                 <w:rStyle w:val="Hyperlink"/>
                 <w:noProof/>
               </w:rPr>
-              <w:t>1.5  ข้อคิดเห็นและคำอธิบาย</w:t>
+              <w:t>1.5  ข้อมูลการอ้างอิง</w:t>
             </w:r>
             <w:r>
               <w:rPr>
@@ -3205,7 +3205,7 @@
                 <w:rStyle w:val="Hyperlink"/>
                 <w:noProof/>
               </w:rPr>
-              <w:t>1.6  การอธิบายการทำงานโดยรวม</w:t>
+              <w:t>1.6  การนำเสนอพฤติกรรมโดยรวม</w:t>
             </w:r>
             <w:r>
               <w:rPr>
@@ -3266,7 +3266,7 @@
                 <w:rStyle w:val="Hyperlink"/>
                 <w:noProof/>
               </w:rPr>
-              <w:t>1.7  ประวัติการกำหนดมาตรฐาน</w:t>
+              <w:t>1.7  ความต้องการทางฟังก์ชัน</w:t>
             </w:r>
             <w:r>
               <w:rPr>
@@ -3693,7 +3693,7 @@
                 <w:rStyle w:val="Hyperlink"/>
                 <w:noProof/>
               </w:rPr>
-              <w:t>1.8  ข้อกำหนดการเชื่อมต่อภายนอก</w:t>
+              <w:t>1.8  ความต้องการการเชื่อมต่อภายนอก</w:t>
             </w:r>
             <w:r>
               <w:rPr>
@@ -3754,7 +3754,7 @@
                 <w:rStyle w:val="Hyperlink"/>
                 <w:noProof/>
               </w:rPr>
-              <w:t>1.8.1  การออกแบบผู้ใช้</w:t>
+              <w:t>1.8.1  อินเตอร์เฟซผู้ใช้</w:t>
             </w:r>
             <w:r>
               <w:rPr>
@@ -3815,7 +3815,7 @@
                 <w:rStyle w:val="Hyperlink"/>
                 <w:noProof/>
               </w:rPr>
-              <w:t>1.8.2  การออกแบบซอฟต์แวร์</w:t>
+              <w:t>1.8.2  อินเตอร์เฟซซอฟต์แวร์</w:t>
             </w:r>
             <w:r>
               <w:rPr>
@@ -3876,7 +3876,7 @@
                 <w:rStyle w:val="Hyperlink"/>
                 <w:noProof/>
               </w:rPr>
-              <w:t>1.8.3  ข้อกำหนดการเชื่อมต่อ</w:t>
+              <w:t>1.8.3  อินเตอร์เฟซการสื่อสาร</w:t>
             </w:r>
             <w:r>
               <w:rPr>
@@ -3937,7 +3937,7 @@
                 <w:rStyle w:val="Hyperlink"/>
                 <w:noProof/>
               </w:rPr>
-              <w:t>ไม่ฟังก์ชันการทำงานที่กำหนดไว้</w:t>
+              <w:t>1.9  ความต้องการไม่ส่งผลต่อการใช้งาน</w:t>
             </w:r>
             <w:r>
               <w:rPr>
@@ -3998,7 +3998,7 @@
                 <w:rStyle w:val="Hyperlink"/>
                 <w:noProof/>
               </w:rPr>
-              <w:t>ความสามารถในการทำงาน</w:t>
+              <w:t>1.9.1  การทำงานได้อย่างมีประสิทธิภาพ</w:t>
             </w:r>
             <w:r>
               <w:rPr>
@@ -4059,7 +4059,7 @@
                 <w:rStyle w:val="Hyperlink"/>
                 <w:noProof/>
               </w:rPr>
-              <w:t>ความสามารถในการปรับเปลี่ยน</w:t>
+              <w:t>1.9.2  การปรับขนาด</w:t>
             </w:r>
             <w:r>
               <w:rPr>
@@ -4120,7 +4120,7 @@
                 <w:rStyle w:val="Hyperlink"/>
                 <w:noProof/>
               </w:rPr>
-              <w:t>ความพร้อมที่จะให้บริการและความน่าเชื่อถือ</w:t>
+              <w:t>1.9.3  ความพร้อมใช้งานและความน่าเชื่อถือ</w:t>
             </w:r>
             <w:r>
               <w:rPr>
@@ -4181,7 +4181,7 @@
                 <w:rStyle w:val="Hyperlink"/>
                 <w:noProof/>
               </w:rPr>
-              <w:t>ความปลอดภัย</w:t>
+              <w:t>1.9.4  ความปลอดภัย</w:t>
             </w:r>
             <w:r>
               <w:rPr>
@@ -4242,7 +4242,7 @@
                 <w:rStyle w:val="Hyperlink"/>
                 <w:noProof/>
               </w:rPr>
-              <w:t>การบำรุงรักษาและยืดหยุ่นในการปรับเปลี่ยน</w:t>
+              <w:t>1.9.5  การบำรุงรักษาและยืดหยุ่นในการปรับเปลี่ยน</w:t>
             </w:r>
             <w:r>
               <w:rPr>
@@ -4303,7 +4303,7 @@
                 <w:rStyle w:val="Hyperlink"/>
                 <w:noProof/>
               </w:rPr>
-              <w:t>การใช้งานที่เหมาะสม</w:t>
+              <w:t>1.9.6  การใช้งานที่เหมาะสม</w:t>
             </w:r>
             <w:r>
               <w:rPr>
@@ -4364,7 +4364,7 @@
                 <w:rStyle w:val="Hyperlink"/>
                 <w:noProof/>
               </w:rPr>
-              <w:t>การตรวจสอบและการติดตาม</w:t>
+              <w:t>1.10  การตรวจสอบและการติดตาม</w:t>
             </w:r>
             <w:r>
               <w:rPr>
@@ -4425,7 +4425,7 @@
                 <w:rStyle w:val="Hyperlink"/>
                 <w:noProof/>
               </w:rPr>
-              <w:t>เอกสารระบบอrchิเตกเจอร์</w:t>
+              <w:t>2 เอกสารระบบการออกแบบ</w:t>
             </w:r>
             <w:r>
               <w:rPr>
@@ -4486,7 +4486,7 @@
                 <w:rStyle w:val="Hyperlink"/>
                 <w:noProof/>
               </w:rPr>
-              <w:t>วัตถุประสงค์และข้อจำกัดในการออกแบบระบบ</w:t>
+              <w:t>2.1  วัตถุประสงค์และข้อจำกัดในการออกแบบ</w:t>
             </w:r>
             <w:r>
               <w:rPr>
@@ -4547,7 +4547,7 @@
                 <w:rStyle w:val="Hyperlink"/>
                 <w:noProof/>
               </w:rPr>
-              <w:t>หลักการพื้นฐานในการออกแบบระบบ</w:t>
+              <w:t>2.2  nguyên tắcการออกแบบ</w:t>
             </w:r>
             <w:r>
               <w:rPr>
@@ -4608,7 +4608,7 @@
                 <w:rStyle w:val="Hyperlink"/>
                 <w:noProof/>
               </w:rPr>
-              <w:t>การมองเห็นระบบ</w:t>
+              <w:t>2.3  การมองเห็นระบบการออกแบบ</w:t>
             </w:r>
             <w:r>
               <w:rPr>
@@ -4669,7 +4669,7 @@
                 <w:rStyle w:val="Hyperlink"/>
                 <w:noProof/>
               </w:rPr>
-              <w:t>การมองเห็นระบบ — อาร์คิเตกเจอร์ระดับลอจิกส์ (High-Level Architecture)</w:t>
+              <w:t>2.3.1  การมองเห็นระบบ — การออกแบบระดับแนวคิดสูง</w:t>
             </w:r>
             <w:r>
               <w:rPr>
@@ -4730,7 +4730,7 @@
                 <w:rStyle w:val="Hyperlink"/>
                 <w:noProof/>
               </w:rPr>
-              <w:t>การมองเห็นระบบ — โดเมนขององค์ประกอบ</w:t>
+              <w:t>2.3.2  การมองเห็นระบบ — การวาดแผนภูมิองค์ประกอบ</w:t>
             </w:r>
             <w:r>
               <w:rPr>
@@ -4791,7 +4791,7 @@
                 <w:rStyle w:val="Hyperlink"/>
                 <w:noProof/>
               </w:rPr>
-              <w:t>การมองเห็นระบบ — สไตล์การดำเนินการที่สำคัญ</w:t>
+              <w:t>2.3.3  การมองเห็นระบบ — สценาริโอสำคัญในการพัฒนา</w:t>
             </w:r>
             <w:r>
               <w:rPr>
@@ -4852,7 +4852,7 @@
                 <w:rStyle w:val="Hyperlink"/>
                 <w:noProof/>
               </w:rPr>
-              <w:t>การมองเห็นระบบ — การติดตั้งและการจัดเก็บ</w:t>
+              <w:t>2.3.4  การมองเห็นระบบ — การติดตั้ง</w:t>
             </w:r>
             <w:r>
               <w:rPr>
@@ -4913,7 +4913,7 @@
                 <w:rStyle w:val="Hyperlink"/>
                 <w:noProof/>
               </w:rPr>
-              <w:t>การมองเห็นระบบ — โมดูลการจัดระเบียบการพัฒนา</w:t>
+              <w:t>2.3.5  การมองเห็นระบบ — การจัดระเบียบโมดูล</w:t>
             </w:r>
             <w:r>
               <w:rPr>
@@ -4974,7 +4974,7 @@
                 <w:rStyle w:val="Hyperlink"/>
                 <w:noProof/>
               </w:rPr>
-              <w:t>การมองเห็นระบบ — การตรวจสอบและรักษาความสมบูรณ์ของข้อมูล</w:t>
+              <w:t>2.4  การไหลของข้อมูลและการยืนยันสถานะ</w:t>
             </w:r>
             <w:r>
               <w:rPr>
@@ -5035,7 +5035,7 @@
                 <w:rStyle w:val="Hyperlink"/>
                 <w:noProof/>
               </w:rPr>
-              <w:t>ความกังวลที่ตัดกัน</w:t>
+              <w:t>2.5  ความกังวลที่ตัดกัน</w:t>
             </w:r>
             <w:r>
               <w:rPr>
@@ -5096,7 +5096,7 @@
                 <w:rStyle w:val="Hyperlink"/>
                 <w:noProof/>
               </w:rPr>
-              <w:t>กลยุทธ์การปรับเปลี่ยนขนาด</w:t>
+              <w:t>2.5.1  วิธีการปรับขนาด</w:t>
             </w:r>
             <w:r>
               <w:rPr>
@@ -5157,7 +5157,7 @@
                 <w:rStyle w:val="Hyperlink"/>
                 <w:noProof/>
               </w:rPr>
-              <w:t>การฟื้นฟูและการต้านทานความเสียหาย</w:t>
+              <w:t>2.5.2  การรักษาความน่าเชื่อถือและการป้องกันอุบัติเหตุ</w:t>
             </w:r>
             <w:r>
               <w:rPr>
@@ -5218,7 +5218,7 @@
                 <w:rStyle w:val="Hyperlink"/>
                 <w:noProof/>
               </w:rPr>
-              <w:t>การมองเห็นระบบ — การสังเกตการณ์</w:t>
+              <w:t>2.5.3  ความเห็นได้</w:t>
             </w:r>
             <w:r>
               <w:rPr>
@@ -5279,7 +5279,7 @@
                 <w:rStyle w:val="Hyperlink"/>
                 <w:noProof/>
               </w:rPr>
-              <w:t>การจัดการการตั้งค่า</w:t>
+              <w:t>2.5.4  การจัดการการตั้งค่า</w:t>
             </w:r>
             <w:r>
               <w:rPr>
@@ -5340,7 +5340,7 @@
                 <w:rStyle w:val="Hyperlink"/>
                 <w:noProof/>
               </w:rPr>
-              <w:t>การทำแผนที่เทคโนโลยี</w:t>
+              <w:t>2.6  การทำความเข้าใจการออกแบบเทคโนโลยี</w:t>
             </w:r>
             <w:r>
               <w:rPr>
@@ -5401,7 +5401,7 @@
                 <w:rStyle w:val="Hyperlink"/>
                 <w:noProof/>
               </w:rPr>
-              <w:t>การตัดสินใจอrchิเตกเจอร์ (ADR สรุป)</w:t>
+              <w:t>2.7  การตัดสินใจทางอrchิเทกเตอร์ (ADR สรุป)</w:t>
             </w:r>
             <w:r>
               <w:rPr>
@@ -5462,7 +5462,7 @@
                 <w:rStyle w:val="Hyperlink"/>
                 <w:noProof/>
               </w:rPr>
-              <w:t>เอกสารออกแบบฐานข้อมูล</w:t>
+              <w:t>3  การออกแบบฐานข้อมูล</w:t>
             </w:r>
             <w:r>
               <w:rPr>
@@ -5523,7 +5523,7 @@
                 <w:rStyle w:val="Hyperlink"/>
                 <w:noProof/>
               </w:rPr>
-              <w:t>หลักการพื้นฐานในการออกแบบฐานข้อมูล</w:t>
+              <w:t>3.1  หลักการออกแบบ</w:t>
             </w:r>
             <w:r>
               <w:rPr>
@@ -5584,7 +5584,7 @@
                 <w:rStyle w:val="Hyperlink"/>
                 <w:noProof/>
               </w:rPr>
-              <w:t>แผนภาพความสัมพันธ์ระหว่างตัวแปร</w:t>
+              <w:t>3.2 แผนภาพ Entity-Relationship</w:t>
             </w:r>
             <w:r>
               <w:rPr>
@@ -5645,7 +5645,7 @@
                 <w:rStyle w:val="Hyperlink"/>
                 <w:noProof/>
               </w:rPr>
-              <w:t>ความสัมพันธ์และการวัดค่า</w:t>
+              <w:t>3.3  ความสัมพันธ์และคุณสมบัติของคาร์ดินัล</w:t>
             </w:r>
             <w:r>
               <w:rPr>
@@ -5706,7 +5706,7 @@
                 <w:rStyle w:val="Hyperlink"/>
                 <w:noProof/>
               </w:rPr>
-              <w:t>คำจำกัดความของตารางและสารานุกรมข้อมูล</w:t>
+              <w:t>3.4  การกำหนดตารางและคำศัพท์ข้อมูล</w:t>
             </w:r>
             <w:r>
               <w:rPr>
@@ -5767,7 +5767,7 @@
                 <w:rStyle w:val="Hyperlink"/>
                 <w:noProof/>
               </w:rPr>
-              <w:t>ผู้ใช้</w:t>
+              <w:t>3.4.1  users</w:t>
             </w:r>
             <w:r>
               <w:rPr>
@@ -5828,7 +5828,7 @@
                 <w:rStyle w:val="Hyperlink"/>
                 <w:noProof/>
               </w:rPr>
-              <w:t>อุปกรณ์</w:t>
+              <w:t>3.4.2  devices</w:t>
             </w:r>
             <w:r>
               <w:rPr>
@@ -5889,7 +5889,7 @@
                 <w:rStyle w:val="Hyperlink"/>
                 <w:noProof/>
               </w:rPr>
-              <w:t>การบำรุงรักษา</w:t>
+              <w:t>3.4.3  automations</w:t>
             </w:r>
             <w:r>
               <w:rPr>
@@ -5950,7 +5950,7 @@
                 <w:rStyle w:val="Hyperlink"/>
                 <w:noProof/>
               </w:rPr>
-              <w:t>บันทึก</w:t>
+              <w:t>3.4.4  logs</w:t>
             </w:r>
             <w:r>
               <w:rPr>
@@ -6011,7 +6011,7 @@
                 <w:rStyle w:val="Hyperlink"/>
                 <w:noProof/>
               </w:rPr>
-              <w:t>refresh_tokens</w:t>
+              <w:t>3.4.5  refresh_tokens</w:t>
             </w:r>
             <w:r>
               <w:rPr>
@@ -6072,7 +6072,7 @@
                 <w:rStyle w:val="Hyperlink"/>
                 <w:noProof/>
               </w:rPr>
-              <w:t>ประเภทที่กำหนดให้เลือก</w:t>
+              <w:t>3.5  ประเภทที่ถูกกำหนดไว้</w:t>
             </w:r>
             <w:r>
               <w:rPr>
@@ -6133,7 +6133,7 @@
                 <w:rStyle w:val="Hyperlink"/>
                 <w:noProof/>
               </w:rPr>
-              <w:t>DDL — โครงสร้างข้อมูลมาตรฐาน</w:t>
+              <w:t>3.6  DDL — ชุดค่าผสมมาตรฐาน</w:t>
             </w:r>
             <w:r>
               <w:rPr>
@@ -6194,7 +6194,7 @@
                 <w:rStyle w:val="Hyperlink"/>
                 <w:noProof/>
               </w:rPr>
-              <w:t>การสร้างดัชนี</w:t>
+              <w:t>3.7  การสร้างดัชนี</w:t>
             </w:r>
             <w:r>
               <w:rPr>
@@ -6255,7 +6255,7 @@
                 <w:rStyle w:val="Hyperlink"/>
                 <w:noProof/>
               </w:rPr>
-              <w:t>ตัวอย่างข้อมูลเริ่มต้น</w:t>
+              <w:t>3.8  ข้อมูลตัวอย่างเพื่อการปลูกถ่าย</w:t>
             </w:r>
             <w:r>
               <w:rPr>
@@ -6316,7 +6316,7 @@
                 <w:rStyle w:val="Hyperlink"/>
                 <w:noProof/>
               </w:rPr>
-              <w:t>การอัปเดต การแบ่งส่วน และการเก็บรักษา</w:t>
+              <w:t>3.9  การย้าย, การแบ่งส่วน และการเก็บรักษา</w:t>
             </w:r>
             <w:r>
               <w:rPr>
@@ -8817,7 +8817,7 @@
                 <w:rStyle w:val="Hyperlink"/>
                 <w:noProof/>
               </w:rPr>
-              <w:t>6.10  ความปลอดภัยและตัวดูแล</w:t>
+              <w:t>6.10  สภาพแวดล้อมและระบบตรวจสอบ</w:t>
             </w:r>
             <w:r>
               <w:rPr>
@@ -8939,7 +8939,7 @@
                 <w:rStyle w:val="Hyperlink"/>
                 <w:noProof/>
               </w:rPr>
-              <w:t>7.1  หลักการออกแบบ</w:t>
+              <w:t>7.1  nguyên tắcการออกแบบ</w:t>
             </w:r>
             <w:r>
               <w:rPr>
@@ -9000,7 +9000,7 @@
                 <w:rStyle w:val="Hyperlink"/>
                 <w:noProof/>
               </w:rPr>
-              <w:t>7.2  การสร้างโครงสร้างข้อมูล</w:t>
+              <w:t>7.2  การวางแผนข้อมูล</w:t>
             </w:r>
             <w:r>
               <w:rPr>
@@ -9061,7 +9061,7 @@
                 <w:rStyle w:val="Hyperlink"/>
                 <w:noProof/>
               </w:rPr>
-              <w:t>7.3  วิธีการออกแบบและกำหนดค่าหน้าจอ</w:t>
+              <w:t>7.3  วิธีการออกแบบและกำหนดค่าหน้า</w:t>
             </w:r>
             <w:r>
               <w:rPr>
@@ -9488,7 +9488,7 @@
                 <w:rStyle w:val="Hyperlink"/>
                 <w:noProof/>
               </w:rPr>
-              <w:t>7.4  โครงสร้างองค์ประกอบ</w:t>
+              <w:t>7.4  การสร้างลำดับองค์ประกอบ</w:t>
             </w:r>
             <w:r>
               <w:rPr>
@@ -9610,7 +9610,7 @@
                 <w:rStyle w:val="Hyperlink"/>
                 <w:noProof/>
               </w:rPr>
-              <w:t>7.6  การเชื่อมต่อรีแอลไทม์</w:t>
+              <w:t>7.6  การเชื่อมต่อเรียลไทม์</w:t>
             </w:r>
             <w:r>
               <w:rPr>
@@ -9671,7 +9671,7 @@
                 <w:rStyle w:val="Hyperlink"/>
                 <w:noProof/>
               </w:rPr>
-              <w:t>7.7  ความสามารถในการปรับขนาดและความเป็นไปได้สำหรับความเข้าถึง</w:t>
+              <w:t>7.7  ความสามารถในการปรับขนาดและความเป็นไปได้สำหรับความยืดหยุ่น และการเข้าถึงได้</w:t>
             </w:r>
             <w:r>
               <w:rPr>
@@ -9732,7 +9732,7 @@
                 <w:rStyle w:val="Hyperlink"/>
                 <w:noProof/>
               </w:rPr>
-              <w:t>7.8  โทเคนการออกแบบ</w:t>
+              <w:t>7.8  โทเค็นออกแบบ</w:t>
             </w:r>
             <w:r>
               <w:rPr>
@@ -9793,7 +9793,7 @@
                 <w:rStyle w:val="Hyperlink"/>
                 <w:noProof/>
               </w:rPr>
-              <w:t>8  การออกแบบเครื่องยนต์ควบคุมอัตโนมัติ</w:t>
+              <w:t>8  การออกแบบเครื่องมืออัตโนมัติ</w:t>
             </w:r>
             <w:r>
               <w:rPr>
@@ -9854,7 +9854,7 @@
                 <w:rStyle w:val="Hyperlink"/>
                 <w:noProof/>
               </w:rPr>
-              <w:t>8.1  หลักการพื้นฐาน</w:t>
+              <w:t>8.1  วิธีการทำงาน</w:t>
             </w:r>
             <w:r>
               <w:rPr>
@@ -9915,7 +9915,7 @@
                 <w:rStyle w:val="Hyperlink"/>
                 <w:noProof/>
               </w:rPr>
-              <w:t>8.2  โครงสร้างแบบกฎ</w:t>
+              <w:t>8.2  โครงสร้างแบบ</w:t>
             </w:r>
             <w:r>
               <w:rPr>
@@ -9976,7 +9976,7 @@
                 <w:rStyle w:val="Hyperlink"/>
                 <w:noProof/>
               </w:rPr>
-              <w:t>8.3  อrchิเทกเตอร์เครื่องยนต์ควบคุมอัตโนมัติ</w:t>
+              <w:t>8.3  อrchิเทกเตอร์เครื่องมือ</w:t>
             </w:r>
             <w:r>
               <w:rPr>
@@ -10037,7 +10037,7 @@
                 <w:rStyle w:val="Hyperlink"/>
                 <w:noProof/>
               </w:rPr>
-              <w:t>8.4  ชेडจูล</w:t>
+              <w:t>8.4  ชาร์จเกอร์</w:t>
             </w:r>
             <w:r>
               <w:rPr>
@@ -10159,7 +10159,7 @@
                 <w:rStyle w:val="Hyperlink"/>
                 <w:noProof/>
               </w:rPr>
-              <w:t>8.6  การประเมินสถานะความเป็นไปได้</w:t>
+              <w:t>8.6  การประเมินเงื่อนไข</w:t>
             </w:r>
             <w:r>
               <w:rPr>
@@ -10220,7 +10220,7 @@
                 <w:rStyle w:val="Hyperlink"/>
                 <w:noProof/>
               </w:rPr>
-              <w:t>8.7  การส่งตัวดำเนินการ</w:t>
+              <w:t>8.7  การส่งการกระทำ</w:t>
             </w:r>
             <w:r>
               <w:rPr>
@@ -10525,7 +10525,7 @@
                 <w:rStyle w:val="Hyperlink"/>
                 <w:noProof/>
               </w:rPr>
-              <w:t>9.2  การยืนยันตัวตนและวงจรการดำเนินชีวิต JWT</w:t>
+              <w:t>9.2  การยืนยันตัวตนและวงจร JWT</w:t>
             </w:r>
             <w:r>
               <w:rPr>
@@ -10586,7 +10586,7 @@
                 <w:rStyle w:val="Hyperlink"/>
                 <w:noProof/>
               </w:rPr>
-              <w:t>9.2.1  ข้อกำหนดที่เกี่ยวข้องกับโทเค็น</w:t>
+              <w:t>9.2.1  คำขอเครดิต</w:t>
             </w:r>
             <w:r>
               <w:rPr>
@@ -10647,7 +10647,7 @@
                 <w:rStyle w:val="Hyperlink"/>
                 <w:noProof/>
               </w:rPr>
-              <w:t>9.3  การเก็บข้อมูลรหัสผ่าน</w:t>
+              <w:t>9.3  การเก็บรหัสผ่าน</w:t>
             </w:r>
             <w:r>
               <w:rPr>
@@ -10708,7 +10708,7 @@
                 <w:rStyle w:val="Hyperlink"/>
                 <w:noProof/>
               </w:rPr>
-              <w:t>9.4  ความปลอดภัยการส่ง (HTTPS/TLS)</w:t>
+              <w:t>9.4  ความปลอดภัยการคมนาคม (HTTPS/TLS)</w:t>
             </w:r>
             <w:r>
               <w:rPr>
@@ -10769,7 +10769,7 @@
                 <w:rStyle w:val="Hyperlink"/>
                 <w:noProof/>
               </w:rPr>
-              <w:t>9.5  ความปลอดภัยของMQTT</w:t>
+              <w:t>9.5  ความปลอดภัย MQTT</w:t>
             </w:r>
             <w:r>
               <w:rPr>
@@ -10891,7 +10891,7 @@
                 <w:rStyle w:val="Hyperlink"/>
                 <w:noProof/>
               </w:rPr>
-              <w:t>9.7  การตรวจสอบข้อมูลนำเข้าและการแปลงข้อมูลออก</w:t>
+              <w:t>9.7  การตรวจสอบข้อมูลและแปลงผลลัพธ์</w:t>
             </w:r>
             <w:r>
               <w:rPr>
@@ -11013,7 +11013,7 @@
                 <w:rStyle w:val="Hyperlink"/>
                 <w:noProof/>
               </w:rPr>
-              <w:t>9.9  การจัดการรหัสลับ</w:t>
+              <w:t>9.9  การจัดการความลับ</w:t>
             </w:r>
             <w:r>
               <w:rPr>
@@ -11074,7 +11074,7 @@
                 <w:rStyle w:val="Hyperlink"/>
                 <w:noProof/>
               </w:rPr>
-              <w:t>9.10  การจำกัดจำนวนการเข้าถึงและการป้องกันการก่อความไม่สงบ</w:t>
+              <w:t>9.10  การจำกัดจำนวนการเข้าถึงและการป้องกันอันตราย</w:t>
             </w:r>
             <w:r>
               <w:rPr>
@@ -11135,7 +11135,7 @@
                 <w:rStyle w:val="Hyperlink"/>
                 <w:noProof/>
               </w:rPr>
-              <w:t>9.11  โครงสร้างความเสี่ยง (STRIDE สรุป)</w:t>
+              <w:t>9.11  โมเดลภัยคุกคาม (STRIDE สรุป)</w:t>
             </w:r>
             <w:r>
               <w:rPr>
@@ -11196,7 +11196,7 @@
                 <w:rStyle w:val="Hyperlink"/>
                 <w:noProof/>
               </w:rPr>
-              <w:t>9.12 การทดสอบความปลอดภัย</w:t>
+              <w:t>9.12  การทดสอบความปลอดภัย</w:t>
             </w:r>
             <w:r>
               <w:rPr>
@@ -13697,7 +13697,7 @@
                 <w:rStyle w:val="Hyperlink"/>
                 <w:noProof/>
               </w:rPr>
-              <w:t>13.2  Shared System Prompt</w:t>
+              <w:t>13.2  พromptร่วมกันระบบ</w:t>
             </w:r>
             <w:r>
               <w:rPr>
@@ -13758,7 +13758,7 @@
                 <w:rStyle w:val="Hyperlink"/>
                 <w:noProof/>
               </w:rPr>
-              <w:t>13.3  Tool-Specific Guidance</w:t>
+              <w:t>13.3  hướng dẫnเฉพาะเครื่องมือ</w:t>
             </w:r>
             <w:r>
               <w:rPr>
@@ -13819,7 +13819,7 @@
                 <w:rStyle w:val="Hyperlink"/>
                 <w:noProof/>
               </w:rPr>
-              <w:t>13.4  Prompt Patterns</w:t>
+              <w:t>13.4  พatternพrompt</w:t>
             </w:r>
             <w:r>
               <w:rPr>
@@ -13880,7 +13880,7 @@
                 <w:rStyle w:val="Hyperlink"/>
                 <w:noProof/>
               </w:rPr>
-              <w:t>13.5  Feature-by-Feature Implementation Plan</w:t>
+              <w:t>13.5  แผนการปฏิบัติการโดยรายคุณสมบัติ</w:t>
             </w:r>
             <w:r>
               <w:rPr>
@@ -13941,7 +13941,7 @@
                 <w:rStyle w:val="Hyperlink"/>
                 <w:noProof/>
               </w:rPr>
-              <w:t>Step 1 — Project scaffold</w:t>
+              <w:t>ขั้นตอนที่ 1 — การสร้างโครงสร้างโปรเจค</w:t>
             </w:r>
             <w:r>
               <w:rPr>
@@ -14002,7 +14002,7 @@
                 <w:rStyle w:val="Hyperlink"/>
                 <w:noProof/>
               </w:rPr>
-              <w:t>Step 2 — Authentication</w:t>
+              <w:t>ขั้นตอนที่ 2 — การยืนยันตัวตน</w:t>
             </w:r>
             <w:r>
               <w:rPr>
@@ -14063,7 +14063,7 @@
                 <w:rStyle w:val="Hyperlink"/>
                 <w:noProof/>
               </w:rPr>
-              <w:t>Step 3 — Devices</w:t>
+              <w:t>ขั้นตอนที่ 3 — อุปกรณ์</w:t>
             </w:r>
             <w:r>
               <w:rPr>
@@ -14124,7 +14124,7 @@
                 <w:rStyle w:val="Hyperlink"/>
                 <w:noProof/>
               </w:rPr>
-              <w:t>Step 4 — MQTT service</w:t>
+              <w:t>ขั้นตอนที่ 4 — บริการMQTT</w:t>
             </w:r>
             <w:r>
               <w:rPr>
@@ -14185,7 +14185,7 @@
                 <w:rStyle w:val="Hyperlink"/>
                 <w:noProof/>
               </w:rPr>
-              <w:t>Step 5 — Relay control end-to-end</w:t>
+              <w:t>ขั้นตอนที่ 5 — การควบคุมรีเลย์ end-to-end</w:t>
             </w:r>
             <w:r>
               <w:rPr>
@@ -14246,7 +14246,7 @@
                 <w:rStyle w:val="Hyperlink"/>
                 <w:noProof/>
               </w:rPr>
-              <w:t>Step 6 — Firmware v1</w:t>
+              <w:t>ขั้นตอนที่ 6 — Firmware v1</w:t>
             </w:r>
             <w:r>
               <w:rPr>
@@ -14307,7 +14307,7 @@
                 <w:rStyle w:val="Hyperlink"/>
                 <w:noProof/>
               </w:rPr>
-              <w:t>Step 7 — WebSocket + dashboard</w:t>
+              <w:t>ขั้นตอนที่ 7 — WebSocket + โดมินชาร์ท</w:t>
             </w:r>
             <w:r>
               <w:rPr>
@@ -14368,7 +14368,7 @@
                 <w:rStyle w:val="Hyperlink"/>
                 <w:noProof/>
               </w:rPr>
-              <w:t>Step 8 — Automation engine</w:t>
+              <w:t>ขั้นตอนที่ 8 — อัลกอริทึมการอัตโนมัติ</w:t>
             </w:r>
             <w:r>
               <w:rPr>
@@ -14429,7 +14429,7 @@
                 <w:rStyle w:val="Hyperlink"/>
                 <w:noProof/>
               </w:rPr>
-              <w:t>Step 9 — Logs + polish</w:t>
+              <w:t>ขั้นตอนที่ 9 — ล็อกส์ + การปรับปรุง</w:t>
             </w:r>
             <w:r>
               <w:rPr>
@@ -14490,7 +14490,7 @@
                 <w:rStyle w:val="Hyperlink"/>
                 <w:noProof/>
               </w:rPr>
-              <w:t>Step 10 — Hardening &amp; deploy</w:t>
+              <w:t>ขั้นตอนที่ 10 — การเข้มแข็งและการจัด deploy</w:t>
             </w:r>
             <w:r>
               <w:rPr>
@@ -14551,7 +14551,7 @@
                 <w:rStyle w:val="Hyperlink"/>
                 <w:noProof/>
               </w:rPr>
-              <w:t>13.6  Guardrails for AI-Generated Code</w:t>
+              <w:t>13.6  แนวทางรักษาความปลอดภัยสำหรับโค้ดที่สร้างโดย AI</w:t>
             </w:r>
             <w:r>
               <w:rPr>
@@ -14612,7 +14612,7 @@
                 <w:rStyle w:val="Hyperlink"/>
                 <w:noProof/>
               </w:rPr>
-              <w:t>14  Testing Plan</w:t>
+              <w:t>14  โครงการการทดสอบ</w:t>
             </w:r>
             <w:r>
               <w:rPr>
@@ -14673,7 +14673,7 @@
                 <w:rStyle w:val="Hyperlink"/>
                 <w:noProof/>
               </w:rPr>
-              <w:t>14.1  Test Strategy Overview</w:t>
+              <w:t>14.1  การวางแผนการทดสอบ</w:t>
             </w:r>
             <w:r>
               <w:rPr>
@@ -14734,7 +14734,7 @@
                 <w:rStyle w:val="Hyperlink"/>
                 <w:noProof/>
               </w:rPr>
-              <w:t>14.2  Unit Testing</w:t>
+              <w:t>14.2  การทดสอบหน่วย</w:t>
             </w:r>
             <w:r>
               <w:rPr>
@@ -14795,7 +14795,7 @@
                 <w:rStyle w:val="Hyperlink"/>
                 <w:noProof/>
               </w:rPr>
-              <w:t>14.3  Integration Testing</w:t>
+              <w:t>14.3  การทดสอบการรวม</w:t>
             </w:r>
             <w:r>
               <w:rPr>
@@ -14856,7 +14856,7 @@
                 <w:rStyle w:val="Hyperlink"/>
                 <w:noProof/>
               </w:rPr>
-              <w:t>14.4  Hardware-in-the-Loop (HIL) Testing</w:t>
+              <w:t>14.4 การทดสอบ Hardware-in-the-Loop (HIL)</w:t>
             </w:r>
             <w:r>
               <w:rPr>
@@ -14917,7 +14917,7 @@
                 <w:rStyle w:val="Hyperlink"/>
                 <w:noProof/>
               </w:rPr>
-              <w:t>14.5  Load and Performance Testing</w:t>
+              <w:t>14.5 การทดสอบความต้านทานและประสิทธิภาพ</w:t>
             </w:r>
             <w:r>
               <w:rPr>
@@ -14978,7 +14978,7 @@
                 <w:rStyle w:val="Hyperlink"/>
                 <w:noProof/>
               </w:rPr>
-              <w:t>14.6  Requirements Traceability (Test Matrix)</w:t>
+              <w:t>14.6  การตรวจสอบความเกี่ยวข้องตามข้อกำหนด (Test Matrix)</w:t>
             </w:r>
             <w:r>
               <w:rPr>
@@ -15039,7 +15039,7 @@
                 <w:rStyle w:val="Hyperlink"/>
                 <w:noProof/>
               </w:rPr>
-              <w:t>14.7  Entry and Exit Criteria</w:t>
+              <w:t>14.7  สิ่งเข้า-ออกของคriteria</w:t>
             </w:r>
             <w:r>
               <w:rPr>
@@ -15100,7 +15100,7 @@
                 <w:rStyle w:val="Hyperlink"/>
                 <w:noProof/>
               </w:rPr>
-              <w:t>14.8  Defect Management</w:t>
+              <w:t>14.8  การจัดการผิดพลาด</w:t>
             </w:r>
             <w:r>
               <w:rPr>
@@ -15161,7 +15161,7 @@
                 <w:rStyle w:val="Hyperlink"/>
                 <w:noProof/>
               </w:rPr>
-              <w:t>15  Future Expansion</w:t>
+              <w:t>15  การขยายตัวในอนาคต</w:t>
             </w:r>
             <w:r>
               <w:rPr>
@@ -15222,7 +15222,7 @@
                 <w:rStyle w:val="Hyperlink"/>
                 <w:noProof/>
               </w:rPr>
-              <w:t>15.1  Extensibility Foundations Already in Place</w:t>
+              <w:t>15.1  หลักฐานการปรับแต่งที่มีอยู่แล้ว</w:t>
             </w:r>
             <w:r>
               <w:rPr>
@@ -15283,7 +15283,7 @@
                 <w:rStyle w:val="Hyperlink"/>
                 <w:noProof/>
               </w:rPr>
-              <w:t>15.2  ESP32 Support</w:t>
+              <w:t>15.2  การสนับสนุน ESP32</w:t>
             </w:r>
             <w:r>
               <w:rPr>
@@ -15344,7 +15344,7 @@
                 <w:rStyle w:val="Hyperlink"/>
                 <w:noProof/>
               </w:rPr>
-              <w:t>15.3  Sensors and Energy Monitoring</w:t>
+              <w:t>15.3  เซนเซอร์และการตรวจจับการใช้พลังงาน</w:t>
             </w:r>
             <w:r>
               <w:rPr>
@@ -15405,7 +15405,7 @@
                 <w:rStyle w:val="Hyperlink"/>
                 <w:noProof/>
               </w:rPr>
-              <w:t>15.4  OTA Firmware Updates</w:t>
+              <w:t>15.4  การอัปเดต Firmware OTA</w:t>
             </w:r>
             <w:r>
               <w:rPr>
@@ -15466,7 +15466,7 @@
                 <w:rStyle w:val="Hyperlink"/>
                 <w:noProof/>
               </w:rPr>
-              <w:t>15.5  AI-Assisted Automation</w:t>
+              <w:t>15.5  การช่วยเหลือ AI สำหรับ automation</w:t>
             </w:r>
             <w:r>
               <w:rPr>
@@ -15588,7 +15588,7 @@
                 <w:rStyle w:val="Hyperlink"/>
                 <w:noProof/>
               </w:rPr>
-              <w:t>15.7  Native Mobile Applications</w:t>
+              <w:t>15.7  การพัฒนาแอปพลิเคชันเคลื่อนที่ตามธรรมชาติ</w:t>
             </w:r>
             <w:r>
               <w:rPr>
@@ -15649,7 +15649,7 @@
                 <w:rStyle w:val="Hyperlink"/>
                 <w:noProof/>
               </w:rPr>
-              <w:t>15.8  Push Notifications</w:t>
+              <w:t>15.8  การส่ง notification</w:t>
             </w:r>
             <w:r>
               <w:rPr>
@@ -15710,7 +15710,7 @@
                 <w:rStyle w:val="Hyperlink"/>
                 <w:noProof/>
               </w:rPr>
-              <w:t>15.9  Multi-User and Multi-Home</w:t>
+              <w:t>15.9  Multi-User และ Multi-Home</w:t>
             </w:r>
             <w:r>
               <w:rPr>
@@ -15771,7 +15771,7 @@
                 <w:rStyle w:val="Hyperlink"/>
                 <w:noProof/>
               </w:rPr>
-              <w:t>15.10  Expansion Summary</w:t>
+              <w:t>15.10  สรุปการขยายตัว</w:t>
             </w:r>
             <w:r>
               <w:rPr>
@@ -15832,7 +15832,7 @@
                 <w:rStyle w:val="Hyperlink"/>
                 <w:noProof/>
               </w:rPr>
-              <w:t>16  Appendices</w:t>
+              <w:t>16  บรรทัดฐานเพิ่มเติม</w:t>
             </w:r>
             <w:r>
               <w:rPr>
@@ -15893,7 +15893,7 @@
                 <w:rStyle w:val="Hyperlink"/>
                 <w:noProof/>
               </w:rPr>
-              <w:t>Appendix A  Glossary</w:t>
+              <w:t>บทบันทึก A  คำจำกัดความ</w:t>
             </w:r>
             <w:r>
               <w:rPr>
@@ -15954,7 +15954,7 @@
                 <w:rStyle w:val="Hyperlink"/>
                 <w:noProof/>
               </w:rPr>
-              <w:t>Appendix B  Requirements Traceability Matrix</w:t>
+              <w:t>บทบันทึก B  โครงสร้างความเกี่ยวข้องตามข้อกำหนด</w:t>
             </w:r>
             <w:r>
               <w:rPr>
@@ -16015,7 +16015,7 @@
                 <w:rStyle w:val="Hyperlink"/>
                 <w:noProof/>
               </w:rPr>
-              <w:t>Appendix C  Configuration Reference</w:t>
+              <w:t>บทบันทึก C  การอ้างอิงการตั้งค่า</w:t>
             </w:r>
             <w:r>
               <w:rPr>
@@ -16076,7 +16076,7 @@
                 <w:rStyle w:val="Hyperlink"/>
                 <w:noProof/>
               </w:rPr>
-              <w:t>Appendix D  Document Conventions</w:t>
+              <w:t>บทบันทึก D  ข้อกำหนดเอกสาร</w:t>
             </w:r>
             <w:r>
               <w:rPr>
@@ -16137,7 +16137,7 @@
                 <w:rStyle w:val="Hyperlink"/>
                 <w:noProof/>
               </w:rPr>
-              <w:t>หนังสือบันทึกการยอมรับ</w:t>
+              <w:t>เอกสารเสริม E การตรวจสอบการยอมรับ</w:t>
             </w:r>
             <w:r>
               <w:rPr>
@@ -16211,7 +16211,7 @@
       </w:pPr>
       <w:bookmarkStart w:id="4" w:name="_Toc233974873"/>
       <w:r>
-        <w:t>1  วิธีการกำหนดมาตรฐานสำหรับส่วนประกอบซอฟต์แวร์</w:t>
+        <w:t>1  วัตถุประสงค์มาตรฐานการกำหนดค่าซอฟต์แวร์</w:t>
       </w:r>
       <w:bookmarkEnd w:id="4"/>
     </w:p>
@@ -16229,7 +16229,7 @@
         <w:t xml:space="preserve"> </w:t>
       </w:r>
       <w:r>
-        <w:t>บทนี้กำหนดมาตรฐานสำหรับแพลตฟอร์มการควบคุมอัตโนมัติบ้านตามมาตรฐาน ISO/IEC/IEEE 29148:2018 บทนี้กำหนดวัตถุประสงค์ ความกว้างขอบเขต ระบบการเชื่อมต่อ การดำเนินการทางฟังก์ชัน และคุณสมบัติที่ดี ซึ่งระบบที่จัดส่งจะต้องตรงตาม</w:t>
+        <w:t>บทนี้กำหนดวัตถุประสงค์และขอบเขตของแพลตฟอร์มควบคุมบ้านในความสัมพันธ์กับ ISO/IEC/IEEE 29148:2018 บทนี้กำหนดวัตถุประสงค์และขอบเขตของแพลตฟอร์มควบคุมบ้าน และกำหนดพฤติกรรมทางฟังก์ชันและคุณสมบัติที่ระบบที่ได้รับจะต้องปฏิบัติตาม โดยแต่ละความต้องการมีความเป็นเอกลักษณ์เดียว ส่วนตัว สามารถตรวจสอบ และสามารถเชื่อมโยงกับความต้องการของผู้มีส่วนได้ส่วนเสีย</w:t>
       </w:r>
     </w:p>
     <w:p>
@@ -16238,7 +16238,7 @@
       </w:pPr>
       <w:bookmarkStart w:id="5" w:name="_Toc233974874"/>
       <w:r>
-        <w:t>1.1 วัตถุประสงค์</w:t>
+        <w:t>1.1  วัตถุประสงค์</w:t>
       </w:r>
       <w:bookmarkEnd w:id="5"/>
     </w:p>
@@ -16248,7 +16248,7 @@
         <w:jc w:val="both"/>
       </w:pPr>
       <w:r>
-        <w:t>วัตถุประสงค์ของเอกสารนี้คือเพื่อกำหนดอย่างชัดเจนและสมบูรณ์แบบว่าแพลตฟอร์มการควบคุมอัตโนมัติบ้านจะทำอะไรให้ระบบออกแบบ ตรวจสอบ และผู้มีส่วนได้ส่วนเสียสามารถแบ่งปันฐานข้อมูลร่วมกันได้ นอกจากนี้ยังเป็นเอกสารที่ใช้เป็นตัวช่วยในการติดต่อกับผู้ค้า</w:t>
+        <w:t>วัตถุประสงค์ของเอกสารนี้คือการกำหนดและทำให้แน่ใจว่าแพลตฟอร์มควบคุมบ้านจะทำอะไรอย่างไรเพื่อให้ทีมงานด้านการออกแบบ การตรวจสอบคุณภาพ และผู้มีส่วนได้ส่วนเสียสามารถแบ่งปันฐานข้อมูลที่เหมือนกันได้ โดยใช้เป็นข้อกำหนดในการออกแบบ การพัฒนา การตรวจสอบ และการยอมรับ</w:t>
       </w:r>
     </w:p>
     <w:p>
@@ -16257,7 +16257,7 @@
       </w:pPr>
       <w:bookmarkStart w:id="6" w:name="_Toc233974875"/>
       <w:r>
-        <w:t>1.2 ความกว้างขอบเขต</w:t>
+        <w:t>1.2  ขอบเขต</w:t>
       </w:r>
       <w:bookmarkEnd w:id="6"/>
     </w:p>
@@ -16267,7 +16267,7 @@
         <w:jc w:val="both"/>
       </w:pPr>
       <w:r>
-        <w:t>แพลตฟอร์มการควบคุมอัตโนมัติบ้านเป็นระบบ Internet-of-Things ที่จัดการโดยตรงระบบ ESP8266-พื้นฐานทั้งหมด แพลตฟอร์มชื่อว่า "แพลตฟอร์มการควบคุมอัตโนมัติบ้าน" (Platform)</w:t>
+        <w:t>แพลตฟอร์มควบคุมบ้านเป็นระบบอินเทอร์เน็ตของสิ่งแวดล้อมที่จัดหาสถานะกลางในการควบคุมเครื่องมือ ESP8266-พื้นฐาน</w:t>
       </w:r>
     </w:p>
     <w:p>
@@ -16275,7 +16275,7 @@
         <w:pStyle w:val="Heading4"/>
       </w:pPr>
       <w:r>
-        <w:t>ในความกว้างขอบเขต</w:t>
+        <w:t>ในขอบเขต</w:t>
       </w:r>
     </w:p>
     <w:p>
@@ -16288,7 +16288,7 @@
         <w:spacing w:after="60" w:line="264" w:lineRule="auto"/>
       </w:pPr>
       <w:r>
-        <w:t>การยืนยันผู้ใช้และการควบคุมเข้าถึงตามบทบาท</w:t>
+        <w:t>การยืนยันผู้ใช้และควบคุมเข้าถึงด้วยการแบ่งแยกระดับ</w:t>
       </w:r>
     </w:p>
     <w:p>
@@ -16301,7 +16301,7 @@
         <w:spacing w:after="60" w:line="264" w:lineRule="auto"/>
       </w:pPr>
       <w:r>
-        <w:t>การจัดการชีวิตของอุปกรณ์ (การลงทะเบียน ชื่อ ห้องจัดเก็บ การลบออก)</w:t>
+        <w:t>การจัดการชีวิตของอุปกรณ์ (การลงทะเบียน ชื่อ ห้อง การลบออก)</w:t>
       </w:r>
     </w:p>
     <w:p>
@@ -16327,7 +16327,7 @@
         <w:spacing w:after="60" w:line="264" w:lineRule="auto"/>
       </w:pPr>
       <w:r>
-        <w:t>การแสดงความมีอยู่ของอุปกรณ์แบบสด (ออนไลน์/ไม่ออนไลน์ RSSI รุ่นซอฟต์แวร์สุดท้าย สิ่งที่สังเกตสุดท้าย)</w:t>
+        <w:t>สถานะความมีอยู่และข้อมูลส่งต่อ (ออนไลน์/ไม่ออนไลน์ RSSI รุ่นเฟิร์มแวร์สุดท้าย)</w:t>
       </w:r>
     </w:p>
     <w:p>
@@ -16340,7 +16340,7 @@
         <w:spacing w:after="60" w:line="264" w:lineRule="auto"/>
       </w:pPr>
       <w:r>
-        <w:t>การควบคุมโดยใช้เวลา วัตถุประสงค์ และภาพถ่ายมืออาชีพ</w:t>
+        <w:t>การควบคุมโดยใช้เวลา ชุดอุปกรณ์ และฉากมือ</w:t>
       </w:r>
     </w:p>
     <w:p>
@@ -16353,7 +16353,7 @@
         <w:spacing w:after="60" w:line="264" w:lineRule="auto"/>
       </w:pPr>
       <w:r>
-        <w:t>การบันทึกกิจกรรมที่ไม่เปลี่ยนแปลงและบันทึกการตรวจสอบ</w:t>
+        <w:t>การบันทึกกิจกรรมที่ไม่สามารถแก้ไขได้และบันทึกการตรวจสอบ</w:t>
       </w:r>
     </w:p>
     <w:p>
@@ -16366,7 +16366,7 @@
         <w:spacing w:after="60" w:line="264" w:lineRule="auto"/>
       </w:pPr>
       <w:r>
-        <w:t>เว็บดैशบอร์ดที่ตอบสนอง การกำหนด API ที่เขียนเอกสาร และการส่งข้อความอุปกรณ์ MQTT</w:t>
+        <w:t>เว็บดैशบอร์ดที่ตอบสนอง การกำหนดค่า API REST และการส่งข้อความอุปกรณ์ MQTT</w:t>
       </w:r>
     </w:p>
     <w:p>
@@ -16379,7 +16379,7 @@
         <w:spacing w:after="60" w:line="264" w:lineRule="auto"/>
       </w:pPr>
       <w:r>
-        <w:t>การติดตั้งภายใต้ TLS-terminating reverse proxy</w:t>
+        <w:t>การขึ้นบรรจุภัณฑ์ภายในเครื่องมือรับ TLS-terminating reverse proxy</w:t>
       </w:r>
     </w:p>
     <w:p>
@@ -16387,7 +16387,7 @@
         <w:pStyle w:val="Heading4"/>
       </w:pPr>
       <w:r>
-        <w:t>ไม่ในขอบเขต (นี้)</w:t>
+        <w:t>ไม่ในวงจรนี้ (เพื่อนำไปใช้ใน Future Expansion)</w:t>
       </w:r>
     </w:p>
     <w:p>
@@ -16400,7 +16400,7 @@
         <w:spacing w:after="60" w:line="264" w:lineRule="auto"/>
       </w:pPr>
       <w:r>
-        <w:t>การเข้าถึงมือถือแบบดิจิตอล (API REST/WebSocket จะให้บริการสำหรับการใช้งานในอนาคต)</w:t>
+        <w:t>แอปพลิเคชันบนมือถือที่เป็นเจ้าบ้าน / แยกความแตกต่างของการค่าใช้จ่ายหลังการใช้งาน</w:t>
       </w:r>
     </w:p>
     <w:p>
@@ -16413,7 +16413,7 @@
         <w:spacing w:after="60" w:line="264" w:lineRule="auto"/>
       </w:pPr>
       <w:r>
-        <w:t>การอัปเดตซอฟต์แวร์ OTA (วางแผน; ดู Future Expansion)</w:t>
+        <w:t>การอัปเดตเฟิร์มแวร์ OTA (วางแผน; ดู Future Expansion)</w:t>
       </w:r>
     </w:p>
     <w:p>
@@ -16426,7 +16426,7 @@
         <w:spacing w:after="60" w:line="264" w:lineRule="auto"/>
       </w:pPr>
       <w:r>
-        <w:t>การเชื่อมต่อเสียงช่วยเหลือภายนอก (Alexa Google Home)</w:t>
+        <w:t>การเชื่อมต่อเสียงร้องผู้ช่วย (Alexa, Google Home)</w:t>
       </w:r>
     </w:p>
     <w:p>
@@ -16439,7 +16439,7 @@
         <w:spacing w:after="60" w:line="264" w:lineRule="auto"/>
       </w:pPr>
       <w:r>
-        <w:t>การจ่ายเงินสำหรับบ้านหลายบ้าน / การแยกแยะความแตกต่างของการใช้งานหลังที่เป็นเจ้าของอุปกรณ์</w:t>
+        <w:t>การจัดการค่าใช้จ่ายหลังการใช้งานและความเป็นส่วนตัวของอุปกรณ์</w:t>
       </w:r>
     </w:p>
     <w:p>
@@ -16448,7 +16448,7 @@
         <w:jc w:val="both"/>
       </w:pPr>
       <w:r>
-        <w:t>อย่างไรก็ตาม อาจจะออกแบบให้สามารถเพิ่มส่วนประกอบเหล่านี้ได้อย่างง่ายดาย โดยอธิบายในบท Future Expansion</w:t>
+        <w:t>อย่างไรก็ตาม อาจจะออกแบบให้สามารถเพิ่มสิ่งที่ไม่อยู่ในวงจรนี้ได้ด้วยการเปลี่ยนแปลงรูปร่างโครงสร้างน้อยมาก ตามที่กล่าวไว้ในบท Future Expansion</w:t>
       </w:r>
     </w:p>
     <w:p>
@@ -16457,7 +16457,7 @@
       </w:pPr>
       <w:bookmarkStart w:id="7" w:name="_Toc233974876"/>
       <w:r>
-        <w:t>1.3 การนำเสนอผลิตภัณฑ์</w:t>
+        <w:t>1.3  ภาพรวมผลิตภัณฑ์</w:t>
       </w:r>
       <w:bookmarkEnd w:id="7"/>
     </w:p>
@@ -16467,7 +16467,7 @@
       </w:pPr>
       <w:bookmarkStart w:id="8" w:name="_Toc233974877"/>
       <w:r>
-        <w:t>1.3.1 การมองเห็นผลิตภัณฑ์</w:t>
+        <w:t>1.3.1  มุมมองของผู้ใช้งาน</w:t>
       </w:r>
       <w:bookmarkEnd w:id="8"/>
     </w:p>
@@ -16477,7 +16477,7 @@
         <w:jc w:val="both"/>
       </w:pPr>
       <w:r>
-        <w:t>แพลตฟอร์มเป็นผลิตภัณฑ์ใหม่ที่ประกอบด้วยอย่างสมบูรณ์ ไม่ใช่ส่วนประกอบของระบบใหญ่ แพลตฟอร์มใช้แนวทางเรื่องลेयर Client-Edge-Application-Messaging-Data-Device</w:t>
+        <w:t>แพลตฟอร์มควบคุมบ้านเป็นผลิตภัณฑ์ที่ใหม่และสามารถจัดการได้ด้วยตนเอง ไม่ใช่เป็นส่วนหนึ่งของระบบที่ใหญ่กว่า แพลตฟอร์มนี้ทำตามโครงสร้างลेयरของคลายเอนด์-เอดจ์-แอปพลิเคชัน-ส่งข้อความ-ข้อมูล-อุปกรณ์</w:t>
       </w:r>
       <w:proofErr w:type="spellStart"/>
       <w:r/>

</xml_diff>

<commit_message>
add that -v can seperte logs
</commit_message>
<xml_diff>
--- a/Home.th.docx
+++ b/Home.th.docx
@@ -68,7 +68,7 @@
           <w:sz w:val="19"/>
           <w:szCs w:val="19"/>
         </w:rPr>
-        <w:t>ความต้องการ · ออกแบบ ·ฐานข้อมูล · สัญญาณส่งผ่าน · Firmware · ความปลอดภัย · การดำเนินงาน</w:t>
+        <w:t>ความต้องการ · ออกแบบ ·ฐานข้อมูล · สารสนเทศ · Firmware · ความปลอดภัย · การควบคุมการเปลี่ยนแปลง</w:t>
       </w:r>
     </w:p>
     <w:p>
@@ -90,7 +90,7 @@
           <w:sz w:val="20"/>
           <w:szCs w:val="20"/>
         </w:rPr>
-        <w:t>เตรียมพร้อมตามมาตรฐาน IEEE/ISO/IEC/IEEE 29148:2018</w:t>
+        <w:t>พร้อมตามมาตรฐาน IEEE/ISO/IEC/IEEE 29148:2018</w:t>
       </w:r>
     </w:p>
     <w:tbl>
@@ -159,7 +159,7 @@
                 <w:sz w:val="19"/>
                 <w:szCs w:val="19"/>
               </w:rPr>
-              <w:t>แพลตฟอร์มควบคุมบ้าน — วัตถุประสงค์การออกแบบแพ็คเกจซอฟต์แวร์</w:t>
+              <w:t>แพลตฟอร์มควบคุมบ้าน — วิธีการออกแบบซอฟต์แวร์</w:t>
             </w:r>
           </w:p>
         </w:tc>
@@ -208,7 +208,7 @@
                 <w:sz w:val="19"/>
                 <w:szCs w:val="19"/>
               </w:rPr>
-              <w:t>รวม SRS + SAD + การออกแบบรายละเอียด</w:t>
+              <w:t>รวม SRS + SAD + Designรายละเอียด</w:t>
             </w:r>
           </w:p>
         </w:tc>
@@ -237,7 +237,7 @@
                 <w:sz w:val="19"/>
                 <w:szCs w:val="19"/>
               </w:rPr>
-              <w:t>เวอร์ชัน</w:t>
+              <w:t>รุ่น</w:t>
             </w:r>
           </w:p>
         </w:tc>
@@ -306,7 +306,7 @@
                 <w:sz w:val="19"/>
                 <w:szCs w:val="19"/>
               </w:rPr>
-              <w:t>ได้รับการตั้งค่าสำหรับการพัฒนา</w:t>
+              <w:t>ยอมรับแล้วสำหรับการพัฒนา</w:t>
             </w:r>
           </w:p>
         </w:tc>
@@ -384,7 +384,7 @@
                 <w:sz w:val="19"/>
                 <w:szCs w:val="19"/>
               </w:rPr>
-              <w:t>ประเภทการรักษาความลับ</w:t>
+              <w:t>ประเภทความลับ</w:t>
             </w:r>
           </w:p>
         </w:tc>
@@ -453,7 +453,7 @@
                 <w:sz w:val="19"/>
                 <w:szCs w:val="19"/>
               </w:rPr>
-              <w:t>ทีมงานด้านการออกแบบ / การสร้างแพลตฟอร์ม</w:t>
+              <w:t>ทีมการออกแบบ / การสร้างแพลตฟอร์ม</w:t>
             </w:r>
           </w:p>
         </w:tc>
@@ -472,7 +472,7 @@
           <w:sz w:val="16"/>
           <w:szCs w:val="16"/>
         </w:rPr>
-        <w:t>ลับ — สำหรับการใช้งานภายในวิศวกรและผู้มีส่วนได้ส่วนเสียเท่านั้น</w:t>
+        <w:t>ลับ — สำหรับการใช้งานภายในงานวิศวกรรมและผู้มีส่วนได้ส่วนเสียเท่านั้น</w:t>
       </w:r>
     </w:p>
     <w:p>
@@ -497,7 +497,7 @@
       </w:pPr>
       <w:bookmarkStart w:id="1" w:name="_Toc233974870"/>
       <w:r>
-        <w:t>ประวัติการแก้ไข</w:t>
+        <w:t>ประวัติการแก้ไขเอกสาร</w:t>
       </w:r>
       <w:bookmarkEnd w:id="1"/>
     </w:p>
@@ -548,7 +548,7 @@
                 <w:sz w:val="18"/>
                 <w:szCs w:val="18"/>
               </w:rPr>
-              <w:t>เวอร์ชัน</w:t>
+              <w:t>รุ่น</w:t>
             </w:r>
           </w:p>
         </w:tc>
@@ -706,7 +706,7 @@
                 <w:sz w:val="18"/>
                 <w:szCs w:val="18"/>
               </w:rPr>
-              <w:t>ร่างโครงสร้างเริ่มต้นจาก SRS ที่มีแหล่งกำเนิด</w:t>
+              <w:t>ร่างโครงสร้างเริ่มต้นจาก SRS ที่มีแหล่งที่มา.</w:t>
             </w:r>
           </w:p>
         </w:tc>
@@ -792,7 +792,7 @@
                 <w:sz w:val="18"/>
                 <w:szCs w:val="18"/>
               </w:rPr>
-              <w:t>เพิ่ม章เรื่องสถาปัตยกรรม,ฐานข้อมูล, MQTT และ API</w:t>
+              <w:t>เพิ่ม章ต่างๆ ที่เกี่ยวข้องกับสถาปัตยกรรม,ฐานข้อมูล,MQTT และ API.</w:t>
             </w:r>
           </w:p>
         </w:tc>
@@ -878,7 +878,7 @@
                 <w:sz w:val="18"/>
                 <w:szCs w:val="18"/>
               </w:rPr>
-              <w:t>บทเรียนเกี่ยวกับ firmware, ความปลอดภัย, การติดตั้งและทดสอบ;การตรวจสอบภายใน</w:t>
+              <w:t>บทความเกี่ยวกับ Firmware, ความปลอดภัย, การติดตั้งและทดสอบ;การตรวจสอบภายใน.</w:t>
             </w:r>
           </w:p>
         </w:tc>
@@ -964,7 +964,7 @@
                 <w:sz w:val="18"/>
                 <w:szCs w:val="18"/>
               </w:rPr>
-              <w:t>ตั้งเป็นฐานสำหรับการพัฒนา. คำแนะนำการตรวจสอบรวมเข้าไปแล้ว</w:t>
+              <w:t>ตั้งเป็นฐานสำหรับการพัฒนา. คำแนะนำการตรวจสอบถูกนำเข้าไป.</w:t>
             </w:r>
           </w:p>
         </w:tc>
@@ -991,7 +991,7 @@
         <w:jc w:val="both"/>
       </w:pPr>
       <w:r>
-        <w:t>เอกสารนี้ต้องได้รับการลงนามจากผู้มีส่วนได้ส่วนเสียที่กำหนดก่อนจะนำมาควบคุมการเปลี่ยนแปลง การเปลี่ยนแปลงที่ตามมาจะต้องขึ้นอยู่กับกระบวนการขอการเปลี่ยนแปลงที่ระบุไว้ในบทความแผนพัฒนาในการพัฒนาของเรา</w:t>
+        <w:t>เอกสารนี้ต้องได้รับการลงนามจากผู้มีส่วนได้ส่วนเสียที่กำหนดก่อนจะนำมาควบคุมการเปลี่ยนแปลง การเปลี่ยนแปลงครั้งต่อไปจะต้องขึ้นอยู่กับกระบวนการขอการเปลี่ยนแปลงที่อธิบายไว้ในบทความแผนกต่าง ๆ</w:t>
       </w:r>
       <w:proofErr w:type="gramStart"/>
       <w:r/>
@@ -1140,7 +1140,7 @@
                 <w:sz w:val="18"/>
                 <w:szCs w:val="18"/>
               </w:rPr>
-              <w:t>ผู้จัดการผลิตภัณฑ์</w:t>
+              <w:t>ผู้ดูแลผลิตภัณฑ์</w:t>
             </w:r>
           </w:p>
         </w:tc>
@@ -1182,7 +1182,7 @@
                 <w:sz w:val="18"/>
                 <w:szCs w:val="18"/>
               </w:rPr>
-              <w:t>สิ่งกำหนดนโยบายและความสำคัญ</w:t>
+              <w:t>วงจรและความสำคัญ</w:t>
             </w:r>
           </w:p>
         </w:tc>
@@ -1226,7 +1226,7 @@
                 <w:sz w:val="18"/>
                 <w:szCs w:val="18"/>
               </w:rPr>
-              <w:t>สถาปนิกนำทีม</w:t>
+              <w:t>ผู้นำสถาปัตยกรรม</w:t>
             </w:r>
           </w:p>
         </w:tc>
@@ -1268,7 +1268,7 @@
                 <w:sz w:val="18"/>
                 <w:szCs w:val="18"/>
               </w:rPr>
-              <w:t>ความถูกต้องทางเทคนิค</w:t>
+              <w:t>ความเหมาะสมทางเทคนิค</w:t>
             </w:r>
           </w:p>
         </w:tc>
@@ -1312,7 +1312,7 @@
                 <w:sz w:val="18"/>
                 <w:szCs w:val="18"/>
               </w:rPr>
-              <w:t>ผู้นำด้านเบื้องหลัง</w:t>
+              <w:t>ผู้นำหลังฝั่งเบนจิน</w:t>
             </w:r>
           </w:p>
         </w:tc>
@@ -1398,7 +1398,7 @@
                 <w:sz w:val="18"/>
                 <w:szCs w:val="18"/>
               </w:rPr>
-              <w:t>ผู้นำด้าน firmware</w:t>
+              <w:t>ผู้นำ Firmware</w:t>
             </w:r>
           </w:p>
         </w:tc>
@@ -1440,7 +1440,7 @@
                 <w:sz w:val="18"/>
                 <w:szCs w:val="18"/>
               </w:rPr>
-              <w:t>firmware ESP8266</w:t>
+              <w:t>ซอฟต์แวร์ ESP8266</w:t>
             </w:r>
           </w:p>
         </w:tc>
@@ -1813,7 +1813,7 @@
                 <w:sz w:val="18"/>
                 <w:szCs w:val="18"/>
               </w:rPr>
-              <w:t>มาตรฐานและข้อกำหนดที่เอกสารนี้อธิบายไว้.</w:t>
+              <w:t>ข้อกำหนดของซอฟต์แวร์ผู้ให้บริการที่นี้เขียนไว้.</w:t>
             </w:r>
           </w:p>
         </w:tc>
@@ -1886,7 +1886,7 @@
                 <w:sz w:val="18"/>
                 <w:szCs w:val="18"/>
               </w:rPr>
-              <w:t>ประเด็นในการออกแบบและการพัฒนาระบบ.</w:t>
+              <w:t>ข้อกำหนดการออกแบบระบบ.</w:t>
             </w:r>
           </w:p>
         </w:tc>
@@ -1951,7 +1951,7 @@
                 <w:sz w:val="18"/>
                 <w:szCs w:val="18"/>
               </w:rPr>
-              <w:t>การอธิบายการออกแบบ.</w:t>
+              <w:t>แนวปฏิบัติในการอธิบายการออกแบบ.</w:t>
             </w:r>
           </w:p>
         </w:tc>
@@ -2017,7 +2017,7 @@
                 <w:sz w:val="18"/>
                 <w:szCs w:val="18"/>
               </w:rPr>
-              <w:t>มาตรฐานการเขียน API OpenAPI Specification 3.1</w:t>
+              <w:t>OpenAPI Specification 3.1</w:t>
             </w:r>
           </w:p>
         </w:tc>
@@ -2038,7 +2038,7 @@
                 <w:sz w:val="18"/>
                 <w:szCs w:val="18"/>
               </w:rPr>
-              <w:t>รูปแบบติดต่อข้อมูล REST API</w:t>
+              <w:t>รูปแบบติดต่อ API ของ REST</w:t>
             </w:r>
           </w:p>
         </w:tc>
@@ -2103,7 +2103,7 @@
                 <w:sz w:val="18"/>
                 <w:szCs w:val="18"/>
               </w:rPr>
-              <w:t>มาตรฐานการส่งข้อความ.</w:t>
+              <w:t>ข้อกำหนดการสื่อสาร</w:t>
             </w:r>
           </w:p>
         </w:tc>
@@ -2290,7 +2290,7 @@
                 <w:rStyle w:val="Hyperlink"/>
                 <w:noProof/>
               </w:rPr>
-              <w:t>ประวัติการแก้ไข</w:t>
+              <w:t>ประวัติการแก้ไขเอกสาร</w:t>
             </w:r>
             <w:r>
               <w:rPr>
@@ -2473,7 +2473,7 @@
                 <w:rStyle w:val="Hyperlink"/>
                 <w:noProof/>
               </w:rPr>
-              <w:t>1  การกำหนดมาตรฐานความต้องการของซอฟต์แวร์</w:t>
+              <w:t>1  วิธีการกำหนดความต้องการของซอฟต์แวร์</w:t>
             </w:r>
             <w:r>
               <w:rPr>
@@ -2595,7 +2595,7 @@
                 <w:rStyle w:val="Hyperlink"/>
                 <w:noProof/>
               </w:rPr>
-              <w:t>1.2  โครงสร้างการทำงาน</w:t>
+              <w:t>1.2  สก๊อป</w:t>
             </w:r>
             <w:r>
               <w:rPr>
@@ -2778,7 +2778,7 @@
                 <w:rStyle w:val="Hyperlink"/>
                 <w:noProof/>
               </w:rPr>
-              <w:t>1.3.2  การดำเนินการผลิตภัณฑ์ (สรุป)</w:t>
+              <w:t>1.3.2  ประวัติการทำงาน (สรุป)</w:t>
             </w:r>
             <w:r>
               <w:rPr>
@@ -2839,7 +2839,7 @@
                 <w:rStyle w:val="Hyperlink"/>
                 <w:noProof/>
               </w:rPr>
-              <w:t>1.3.3  ชั้นผู้ใช้และคุณสมบัติของผู้ใช้</w:t>
+              <w:t>1.3.3  ชั้นผู้ใช้และคุณสมบัติ</w:t>
             </w:r>
             <w:r>
               <w:rPr>
@@ -2961,7 +2961,7 @@
                 <w:rStyle w:val="Hyperlink"/>
                 <w:noProof/>
               </w:rPr>
-              <w:t>1.3.5  การออกแบบและการดำเนินการข้อจำกัด</w:t>
+              <w:t>1.3.5  ข้อจำกัดในการออกแบบและการปฏิบัติงาน</w:t>
             </w:r>
             <w:r>
               <w:rPr>
@@ -3022,7 +3022,7 @@
                 <w:rStyle w:val="Hyperlink"/>
                 <w:noProof/>
               </w:rPr>
-              <w:t>1.3.6  ความเชื่อมโยงและความตั้งใจ</w:t>
+              <w:t>1.3.6  การตั้งสมมติฐานและขึ้นอยู่กับอื่น ๆ</w:t>
             </w:r>
             <w:r>
               <w:rPr>
@@ -3083,7 +3083,7 @@
                 <w:rStyle w:val="Hyperlink"/>
                 <w:noProof/>
               </w:rPr>
-              <w:t>1.4  คำจำกัดความ อักขระ และอักษรย่อ</w:t>
+              <w:t>1.4  คำจำกัดความ อักขระ และการย่อ</w:t>
             </w:r>
             <w:r>
               <w:rPr>
@@ -3144,7 +3144,7 @@
                 <w:rStyle w:val="Hyperlink"/>
                 <w:noProof/>
               </w:rPr>
-              <w:t>1.5  ข้อมูลการอ้างอิง</w:t>
+              <w:t>1.5  หมายเหตุ</w:t>
             </w:r>
             <w:r>
               <w:rPr>
@@ -3571,7 +3571,7 @@
                 <w:rStyle w:val="Hyperlink"/>
                 <w:noProof/>
               </w:rPr>
-              <w:t>1.7.5  การควบคุมการทำงาน</w:t>
+              <w:t>1.7.5  การจัดการการอัตโนมัติ</w:t>
             </w:r>
             <w:r>
               <w:rPr>
@@ -3693,7 +3693,7 @@
                 <w:rStyle w:val="Hyperlink"/>
                 <w:noProof/>
               </w:rPr>
-              <w:t>1.8  ความต้องการการเชื่อมต่อภายนอก</w:t>
+              <w:t>1.8  ความต้องการของการเชื่อมต่อภายนอก</w:t>
             </w:r>
             <w:r>
               <w:rPr>
@@ -3754,7 +3754,7 @@
                 <w:rStyle w:val="Hyperlink"/>
                 <w:noProof/>
               </w:rPr>
-              <w:t>1.8.1  อินเตอร์เฟซผู้ใช้</w:t>
+              <w:t>1.8.1  ระบบผู้ใช้</w:t>
             </w:r>
             <w:r>
               <w:rPr>
@@ -3815,7 +3815,7 @@
                 <w:rStyle w:val="Hyperlink"/>
                 <w:noProof/>
               </w:rPr>
-              <w:t>1.8.2  อินเตอร์เฟซซอฟต์แวร์</w:t>
+              <w:t>1.8.2  ระบบซอฟต์แวร์</w:t>
             </w:r>
             <w:r>
               <w:rPr>
@@ -3876,7 +3876,7 @@
                 <w:rStyle w:val="Hyperlink"/>
                 <w:noProof/>
               </w:rPr>
-              <w:t>1.8.3  อินเตอร์เฟซการสื่อสาร</w:t>
+              <w:t>1.8.3  ระบบการเชื่อมต่อ</w:t>
             </w:r>
             <w:r>
               <w:rPr>
@@ -3937,7 +3937,7 @@
                 <w:rStyle w:val="Hyperlink"/>
                 <w:noProof/>
               </w:rPr>
-              <w:t>1.9  ความต้องการไม่ส่งผลต่อการใช้งาน</w:t>
+              <w:t>1.9  ความต้องการไม่ส่งผลต่อการทำงาน</w:t>
             </w:r>
             <w:r>
               <w:rPr>
@@ -3998,7 +3998,7 @@
                 <w:rStyle w:val="Hyperlink"/>
                 <w:noProof/>
               </w:rPr>
-              <w:t>1.9.1  การทำงานได้อย่างมีประสิทธิภาพ</w:t>
+              <w:t>1.9.1  การทำงานได้เร็ว</w:t>
             </w:r>
             <w:r>
               <w:rPr>
@@ -4120,7 +4120,7 @@
                 <w:rStyle w:val="Hyperlink"/>
                 <w:noProof/>
               </w:rPr>
-              <w:t>1.9.3  ความพร้อมใช้งานและความน่าเชื่อถือ</w:t>
+              <w:t>1.9.3  ความพร้อมและความน่าเชื่อถือ</w:t>
             </w:r>
             <w:r>
               <w:rPr>
@@ -4242,7 +4242,7 @@
                 <w:rStyle w:val="Hyperlink"/>
                 <w:noProof/>
               </w:rPr>
-              <w:t>1.9.5  การบำรุงรักษาและยืดหยุ่นในการปรับเปลี่ยน</w:t>
+              <w:t>1.9.5  ความสามารถในการบำรุงรักษาและนำไปใช้</w:t>
             </w:r>
             <w:r>
               <w:rPr>
@@ -4303,7 +4303,7 @@
                 <w:rStyle w:val="Hyperlink"/>
                 <w:noProof/>
               </w:rPr>
-              <w:t>1.9.6  การใช้งานที่เหมาะสม</w:t>
+              <w:t>1.9.6  การใช้งาน</w:t>
             </w:r>
             <w:r>
               <w:rPr>
@@ -4486,7 +4486,7 @@
                 <w:rStyle w:val="Hyperlink"/>
                 <w:noProof/>
               </w:rPr>
-              <w:t>2.1  วัตถุประสงค์และข้อจำกัดในการออกแบบ</w:t>
+              <w:t>2.1  เป้าหมายและข้อจำกัดในการออกแบบระบบ</w:t>
             </w:r>
             <w:r>
               <w:rPr>
@@ -4547,7 +4547,7 @@
                 <w:rStyle w:val="Hyperlink"/>
                 <w:noProof/>
               </w:rPr>
-              <w:t>2.2  nguyên tắcการออกแบบ</w:t>
+              <w:t>2.2  หลักการพื้นฐานในการออกแบบระบบ</w:t>
             </w:r>
             <w:r>
               <w:rPr>
@@ -4608,7 +4608,7 @@
                 <w:rStyle w:val="Hyperlink"/>
                 <w:noProof/>
               </w:rPr>
-              <w:t>2.3  การมองเห็นระบบการออกแบบ</w:t>
+              <w:t>2.3  การมองเห็นระบบ</w:t>
             </w:r>
             <w:r>
               <w:rPr>
@@ -4669,7 +4669,7 @@
                 <w:rStyle w:val="Hyperlink"/>
                 <w:noProof/>
               </w:rPr>
-              <w:t>2.3.1  การมองเห็นระบบ — การออกแบบระดับแนวคิดสูง</w:t>
+              <w:t>2.3.1  การมองเห็นแบบตรรกะ — การออกแบบระดับอัลกอริทึมสูง</w:t>
             </w:r>
             <w:r>
               <w:rPr>
@@ -4730,7 +4730,7 @@
                 <w:rStyle w:val="Hyperlink"/>
                 <w:noProof/>
               </w:rPr>
-              <w:t>2.3.2  การมองเห็นระบบ — การวาดแผนภูมิองค์ประกอบ</w:t>
+              <w:t>2.3.2  การมองเห็นแบบตรรกะ — การวาดแผนภูมิองค์ประกอบ</w:t>
             </w:r>
             <w:r>
               <w:rPr>
@@ -4791,7 +4791,7 @@
                 <w:rStyle w:val="Hyperlink"/>
                 <w:noProof/>
               </w:rPr>
-              <w:t>2.3.3  การมองเห็นระบบ — สценาริโอสำคัญในการพัฒนา</w:t>
+              <w:t>2.3.3  การมองเห็นแบบกระบวนการ — สกenarioสำคัญ</w:t>
             </w:r>
             <w:r>
               <w:rPr>
@@ -4852,7 +4852,7 @@
                 <w:rStyle w:val="Hyperlink"/>
                 <w:noProof/>
               </w:rPr>
-              <w:t>2.3.4  การมองเห็นระบบ — การติดตั้ง</w:t>
+              <w:t>2.3.4  การมองเห็นแบบร่างกาย — การจัดตั้งการนำไปใช้</w:t>
             </w:r>
             <w:r>
               <w:rPr>
@@ -4913,7 +4913,7 @@
                 <w:rStyle w:val="Hyperlink"/>
                 <w:noProof/>
               </w:rPr>
-              <w:t>2.3.5  การมองเห็นระบบ — การจัดระเบียบโมดูล</w:t>
+              <w:t>2.3.5  การมองเห็นแบบพัฒนาการ — การจัดระเบียบโมดูล</w:t>
             </w:r>
             <w:r>
               <w:rPr>
@@ -5157,7 +5157,7 @@
                 <w:rStyle w:val="Hyperlink"/>
                 <w:noProof/>
               </w:rPr>
-              <w:t>2.5.2  การรักษาความน่าเชื่อถือและการป้องกันอุบัติเหตุ</w:t>
+              <w:t>2.5.2  การรักษาความสามารถในการรับมือกับความผิดพลาด</w:t>
             </w:r>
             <w:r>
               <w:rPr>
@@ -5279,7 +5279,7 @@
                 <w:rStyle w:val="Hyperlink"/>
                 <w:noProof/>
               </w:rPr>
-              <w:t>2.5.4  การจัดการการตั้งค่า</w:t>
+              <w:t>2.5.4  การจัดการการปรับแต่ง</w:t>
             </w:r>
             <w:r>
               <w:rPr>
@@ -5340,7 +5340,7 @@
                 <w:rStyle w:val="Hyperlink"/>
                 <w:noProof/>
               </w:rPr>
-              <w:t>2.6  การทำความเข้าใจการออกแบบเทคโนโลยี</w:t>
+              <w:t>2.6  การทำความเข้าใจเทคโนโลยี</w:t>
             </w:r>
             <w:r>
               <w:rPr>
@@ -5401,7 +5401,7 @@
                 <w:rStyle w:val="Hyperlink"/>
                 <w:noProof/>
               </w:rPr>
-              <w:t>2.7  การตัดสินใจทางอrchิเทกเตอร์ (ADR สรุป)</w:t>
+              <w:t>2.7  การตัดสินใจทางสถาปัตยกรรม (ADR สรุป)</w:t>
             </w:r>
             <w:r>
               <w:rPr>
@@ -5523,7 +5523,7 @@
                 <w:rStyle w:val="Hyperlink"/>
                 <w:noProof/>
               </w:rPr>
-              <w:t>3.1  หลักการออกแบบ</w:t>
+              <w:t>3.1  หลักการพื้นฐานในการออกแบบฐานข้อมูล</w:t>
             </w:r>
             <w:r>
               <w:rPr>
@@ -5584,7 +5584,7 @@
                 <w:rStyle w:val="Hyperlink"/>
                 <w:noProof/>
               </w:rPr>
-              <w:t>3.2 แผนภาพ Entity-Relationship</w:t>
+              <w:t>3.2 แผนภาพสัมพันธ์ระหว่างตัวแปร</w:t>
             </w:r>
             <w:r>
               <w:rPr>
@@ -5645,7 +5645,7 @@
                 <w:rStyle w:val="Hyperlink"/>
                 <w:noProof/>
               </w:rPr>
-              <w:t>3.3  ความสัมพันธ์และคุณสมบัติของคาร์ดินัล</w:t>
+              <w:t>3.3  ความสัมพันธ์และการบัตร</w:t>
             </w:r>
             <w:r>
               <w:rPr>
@@ -5706,7 +5706,7 @@
                 <w:rStyle w:val="Hyperlink"/>
                 <w:noProof/>
               </w:rPr>
-              <w:t>3.4  การกำหนดตารางและคำศัพท์ข้อมูล</w:t>
+              <w:t>3.4  การกำหนดค่าแท็บเล็ตและคำศัพท์ข้อมูล</w:t>
             </w:r>
             <w:r>
               <w:rPr>
@@ -6072,7 +6072,7 @@
                 <w:rStyle w:val="Hyperlink"/>
                 <w:noProof/>
               </w:rPr>
-              <w:t>3.5  ประเภทที่ถูกกำหนดไว้</w:t>
+              <w:t>3.5  ประเภทที่กำหนดค่า</w:t>
             </w:r>
             <w:r>
               <w:rPr>
@@ -6133,7 +6133,7 @@
                 <w:rStyle w:val="Hyperlink"/>
                 <w:noProof/>
               </w:rPr>
-              <w:t>3.6  DDL — ชุดค่าผสมมาตรฐาน</w:t>
+              <w:t>3.6  DDL — ชุดข้อมูลมาตรฐาน</w:t>
             </w:r>
             <w:r>
               <w:rPr>
@@ -6255,7 +6255,7 @@
                 <w:rStyle w:val="Hyperlink"/>
                 <w:noProof/>
               </w:rPr>
-              <w:t>3.8  ข้อมูลตัวอย่างเพื่อการปลูกถ่าย</w:t>
+              <w:t>3.8  ข้อมูลตัวอย่างเพื่อการปลูกตั้ง</w:t>
             </w:r>
             <w:r>
               <w:rPr>
@@ -6316,7 +6316,7 @@
                 <w:rStyle w:val="Hyperlink"/>
                 <w:noProof/>
               </w:rPr>
-              <w:t>3.9  การย้าย, การแบ่งส่วน และการเก็บรักษา</w:t>
+              <w:t>3.9  การย้าย, การแบ่งส่วน และการรักษาความเป็นอยู่</w:t>
             </w:r>
             <w:r>
               <w:rPr>
@@ -8817,7 +8817,7 @@
                 <w:rStyle w:val="Hyperlink"/>
                 <w:noProof/>
               </w:rPr>
-              <w:t>6.10  สภาพแวดล้อมและระบบตรวจสอบ</w:t>
+              <w:t>6.10  สภาพแวดล้อมและตัวตรวจสอบ</w:t>
             </w:r>
             <w:r>
               <w:rPr>
@@ -9061,7 +9061,7 @@
                 <w:rStyle w:val="Hyperlink"/>
                 <w:noProof/>
               </w:rPr>
-              <w:t>7.3  วิธีการออกแบบและกำหนดค่าหน้า</w:t>
+              <w:t>7.3  วงรูปและมาตรฐานหน้าเว็บ</w:t>
             </w:r>
             <w:r>
               <w:rPr>
@@ -9183,7 +9183,7 @@
                 <w:rStyle w:val="Hyperlink"/>
                 <w:noProof/>
               </w:rPr>
-              <w:t>7.3.2  แบบรายการ</w:t>
+              <w:t>7.3.2  แบตซ์</w:t>
             </w:r>
             <w:r>
               <w:rPr>
@@ -9427,7 +9427,7 @@
                 <w:rStyle w:val="Hyperlink"/>
                 <w:noProof/>
               </w:rPr>
-              <w:t>7.3.6  แบบรายการของอุปกรณ์ (รายละเอียดองค์ประกอบ)</w:t>
+              <w:t>7.3.6  แบตซ์ (รายละเอียดองค์ประกอบ)</w:t>
             </w:r>
             <w:r>
               <w:rPr>
@@ -9610,7 +9610,7 @@
                 <w:rStyle w:val="Hyperlink"/>
                 <w:noProof/>
               </w:rPr>
-              <w:t>7.6  การเชื่อมต่อเรียลไทม์</w:t>
+              <w:t>7.6  การเชื่อมต่อแบบเรียลไทม์</w:t>
             </w:r>
             <w:r>
               <w:rPr>
@@ -9671,7 +9671,7 @@
                 <w:rStyle w:val="Hyperlink"/>
                 <w:noProof/>
               </w:rPr>
-              <w:t>7.7  ความสามารถในการปรับขนาดและความเป็นไปได้สำหรับความยืดหยุ่น และการเข้าถึงได้</w:t>
+              <w:t>7.7  ความสามารถในการปรับขนาดและความเป็นไปได้ในการเข้าถึง</w:t>
             </w:r>
             <w:r>
               <w:rPr>
@@ -9732,7 +9732,7 @@
                 <w:rStyle w:val="Hyperlink"/>
                 <w:noProof/>
               </w:rPr>
-              <w:t>7.8  โทเค็นออกแบบ</w:t>
+              <w:t>7.8  โทเคนการออกแบบ</w:t>
             </w:r>
             <w:r>
               <w:rPr>
@@ -9854,7 +9854,7 @@
                 <w:rStyle w:val="Hyperlink"/>
                 <w:noProof/>
               </w:rPr>
-              <w:t>8.1  วิธีการทำงาน</w:t>
+              <w:t>8.1  วัตถุประสงค์</w:t>
             </w:r>
             <w:r>
               <w:rPr>
@@ -9915,7 +9915,7 @@
                 <w:rStyle w:val="Hyperlink"/>
                 <w:noProof/>
               </w:rPr>
-              <w:t>8.2  โครงสร้างแบบ</w:t>
+              <w:t>8.2  โครงสร้างกฎ</w:t>
             </w:r>
             <w:r>
               <w:rPr>
@@ -9976,7 +9976,7 @@
                 <w:rStyle w:val="Hyperlink"/>
                 <w:noProof/>
               </w:rPr>
-              <w:t>8.3  อrchิเทกเตอร์เครื่องมือ</w:t>
+              <w:t>8.3  อrchิเทกเตอร์ของเครื่องมือ</w:t>
             </w:r>
             <w:r>
               <w:rPr>
@@ -10037,7 +10037,7 @@
                 <w:rStyle w:val="Hyperlink"/>
                 <w:noProof/>
               </w:rPr>
-              <w:t>8.4  ชาร์จเกอร์</w:t>
+              <w:t>8.4  ชheduler</w:t>
             </w:r>
             <w:r>
               <w:rPr>
@@ -10525,7 +10525,7 @@
                 <w:rStyle w:val="Hyperlink"/>
                 <w:noProof/>
               </w:rPr>
-              <w:t>9.2  การยืนยันตัวตนและวงจร JWT</w:t>
+              <w:t>9.2  การยืนยันตัวตนและชีวิตการทำงานของ JWT</w:t>
             </w:r>
             <w:r>
               <w:rPr>
@@ -10586,7 +10586,7 @@
                 <w:rStyle w:val="Hyperlink"/>
                 <w:noProof/>
               </w:rPr>
-              <w:t>9.2.1  คำขอเครดิต</w:t>
+              <w:t>9.2.1  ข้อกำหนดที่ใช้สำหรับโทเค็น</w:t>
             </w:r>
             <w:r>
               <w:rPr>
@@ -10647,7 +10647,7 @@
                 <w:rStyle w:val="Hyperlink"/>
                 <w:noProof/>
               </w:rPr>
-              <w:t>9.3  การเก็บรหัสผ่าน</w:t>
+              <w:t>9.3  การเก็บข้อมูลรหัสผ่าน</w:t>
             </w:r>
             <w:r>
               <w:rPr>
@@ -10708,7 +10708,7 @@
                 <w:rStyle w:val="Hyperlink"/>
                 <w:noProof/>
               </w:rPr>
-              <w:t>9.4  ความปลอดภัยการคมนาคม (HTTPS/TLS)</w:t>
+              <w:t>9.4  ความปลอดภัยการโจรกรรม (HTTPS/TLS)</w:t>
             </w:r>
             <w:r>
               <w:rPr>
@@ -10769,7 +10769,7 @@
                 <w:rStyle w:val="Hyperlink"/>
                 <w:noProof/>
               </w:rPr>
-              <w:t>9.5  ความปลอดภัย MQTT</w:t>
+              <w:t>9.5  ความปลอดภัยของMQTT</w:t>
             </w:r>
             <w:r>
               <w:rPr>
@@ -10891,7 +10891,7 @@
                 <w:rStyle w:val="Hyperlink"/>
                 <w:noProof/>
               </w:rPr>
-              <w:t>9.7  การตรวจสอบข้อมูลและแปลงผลลัพธ์</w:t>
+              <w:t>9.7  การตรวจสอบข้อมูลและแปลงข้อมูลออก</w:t>
             </w:r>
             <w:r>
               <w:rPr>
@@ -11074,7 +11074,7 @@
                 <w:rStyle w:val="Hyperlink"/>
                 <w:noProof/>
               </w:rPr>
-              <w:t>9.10  การจำกัดจำนวนการเข้าถึงและการป้องกันอันตราย</w:t>
+              <w:t>9.10  การจำกัดจำนวนและป้องกันการละเมิด</w:t>
             </w:r>
             <w:r>
               <w:rPr>
@@ -13697,7 +13697,7 @@
                 <w:rStyle w:val="Hyperlink"/>
                 <w:noProof/>
               </w:rPr>
-              <w:t>13.2  พromptร่วมกันระบบ</w:t>
+              <w:t>13.2  Shared System Prompt</w:t>
             </w:r>
             <w:r>
               <w:rPr>
@@ -13758,7 +13758,7 @@
                 <w:rStyle w:val="Hyperlink"/>
                 <w:noProof/>
               </w:rPr>
-              <w:t>13.3  hướng dẫnเฉพาะเครื่องมือ</w:t>
+              <w:t>13.3  Tool-Specific Guidance</w:t>
             </w:r>
             <w:r>
               <w:rPr>
@@ -13819,7 +13819,7 @@
                 <w:rStyle w:val="Hyperlink"/>
                 <w:noProof/>
               </w:rPr>
-              <w:t>13.4  พatternพrompt</w:t>
+              <w:t>13.4  Prompt Patterns</w:t>
             </w:r>
             <w:r>
               <w:rPr>
@@ -13880,7 +13880,7 @@
                 <w:rStyle w:val="Hyperlink"/>
                 <w:noProof/>
               </w:rPr>
-              <w:t>13.5  แผนการปฏิบัติการโดยรายคุณสมบัติ</w:t>
+              <w:t>13.5  Feature-by-Feature Implementation Plan</w:t>
             </w:r>
             <w:r>
               <w:rPr>
@@ -13941,7 +13941,7 @@
                 <w:rStyle w:val="Hyperlink"/>
                 <w:noProof/>
               </w:rPr>
-              <w:t>ขั้นตอนที่ 1 — การสร้างโครงสร้างโปรเจค</w:t>
+              <w:t>Step 1 — Project scaffold</w:t>
             </w:r>
             <w:r>
               <w:rPr>
@@ -14002,7 +14002,7 @@
                 <w:rStyle w:val="Hyperlink"/>
                 <w:noProof/>
               </w:rPr>
-              <w:t>ขั้นตอนที่ 2 — การยืนยันตัวตน</w:t>
+              <w:t>Step 2 — Authentication</w:t>
             </w:r>
             <w:r>
               <w:rPr>
@@ -14063,7 +14063,7 @@
                 <w:rStyle w:val="Hyperlink"/>
                 <w:noProof/>
               </w:rPr>
-              <w:t>ขั้นตอนที่ 3 — อุปกรณ์</w:t>
+              <w:t>Step 3 — Devices</w:t>
             </w:r>
             <w:r>
               <w:rPr>
@@ -14124,7 +14124,7 @@
                 <w:rStyle w:val="Hyperlink"/>
                 <w:noProof/>
               </w:rPr>
-              <w:t>ขั้นตอนที่ 4 — บริการMQTT</w:t>
+              <w:t>Step 4 — MQTT service</w:t>
             </w:r>
             <w:r>
               <w:rPr>
@@ -14185,7 +14185,7 @@
                 <w:rStyle w:val="Hyperlink"/>
                 <w:noProof/>
               </w:rPr>
-              <w:t>ขั้นตอนที่ 5 — การควบคุมรีเลย์ end-to-end</w:t>
+              <w:t>Step 5 — Relay control end-to-end</w:t>
             </w:r>
             <w:r>
               <w:rPr>
@@ -14246,7 +14246,7 @@
                 <w:rStyle w:val="Hyperlink"/>
                 <w:noProof/>
               </w:rPr>
-              <w:t>ขั้นตอนที่ 6 — Firmware v1</w:t>
+              <w:t>Step 6 — Firmware v1</w:t>
             </w:r>
             <w:r>
               <w:rPr>
@@ -14307,7 +14307,7 @@
                 <w:rStyle w:val="Hyperlink"/>
                 <w:noProof/>
               </w:rPr>
-              <w:t>ขั้นตอนที่ 7 — WebSocket + โดมินชาร์ท</w:t>
+              <w:t>Step 7 — WebSocket + dashboard</w:t>
             </w:r>
             <w:r>
               <w:rPr>
@@ -14368,7 +14368,7 @@
                 <w:rStyle w:val="Hyperlink"/>
                 <w:noProof/>
               </w:rPr>
-              <w:t>ขั้นตอนที่ 8 — อัลกอริทึมการอัตโนมัติ</w:t>
+              <w:t>Step 8 — Automation engine</w:t>
             </w:r>
             <w:r>
               <w:rPr>
@@ -14429,7 +14429,7 @@
                 <w:rStyle w:val="Hyperlink"/>
                 <w:noProof/>
               </w:rPr>
-              <w:t>ขั้นตอนที่ 9 — ล็อกส์ + การปรับปรุง</w:t>
+              <w:t>Step 9 — Logs + polish</w:t>
             </w:r>
             <w:r>
               <w:rPr>
@@ -14490,7 +14490,7 @@
                 <w:rStyle w:val="Hyperlink"/>
                 <w:noProof/>
               </w:rPr>
-              <w:t>ขั้นตอนที่ 10 — การเข้มแข็งและการจัด deploy</w:t>
+              <w:t>Step 10 — Hardening &amp; deploy</w:t>
             </w:r>
             <w:r>
               <w:rPr>
@@ -14551,7 +14551,7 @@
                 <w:rStyle w:val="Hyperlink"/>
                 <w:noProof/>
               </w:rPr>
-              <w:t>13.6  แนวทางรักษาความปลอดภัยสำหรับโค้ดที่สร้างโดย AI</w:t>
+              <w:t>13.6  Guardrails for AI-Generated Code</w:t>
             </w:r>
             <w:r>
               <w:rPr>
@@ -14612,7 +14612,7 @@
                 <w:rStyle w:val="Hyperlink"/>
                 <w:noProof/>
               </w:rPr>
-              <w:t>14  โครงการการทดสอบ</w:t>
+              <w:t>14  Testing Plan</w:t>
             </w:r>
             <w:r>
               <w:rPr>
@@ -14673,7 +14673,7 @@
                 <w:rStyle w:val="Hyperlink"/>
                 <w:noProof/>
               </w:rPr>
-              <w:t>14.1  การวางแผนการทดสอบ</w:t>
+              <w:t>14.1  Test Strategy Overview</w:t>
             </w:r>
             <w:r>
               <w:rPr>
@@ -14734,7 +14734,7 @@
                 <w:rStyle w:val="Hyperlink"/>
                 <w:noProof/>
               </w:rPr>
-              <w:t>14.2  การทดสอบหน่วย</w:t>
+              <w:t>14.2  Unit Testing</w:t>
             </w:r>
             <w:r>
               <w:rPr>
@@ -14795,7 +14795,7 @@
                 <w:rStyle w:val="Hyperlink"/>
                 <w:noProof/>
               </w:rPr>
-              <w:t>14.3  การทดสอบการรวม</w:t>
+              <w:t>14.3  Integration Testing</w:t>
             </w:r>
             <w:r>
               <w:rPr>
@@ -14856,7 +14856,7 @@
                 <w:rStyle w:val="Hyperlink"/>
                 <w:noProof/>
               </w:rPr>
-              <w:t>14.4 การทดสอบ Hardware-in-the-Loop (HIL)</w:t>
+              <w:t>14.4  Hardware-in-the-Loop (HIL) Testing</w:t>
             </w:r>
             <w:r>
               <w:rPr>
@@ -14917,7 +14917,7 @@
                 <w:rStyle w:val="Hyperlink"/>
                 <w:noProof/>
               </w:rPr>
-              <w:t>14.5 การทดสอบความต้านทานและประสิทธิภาพ</w:t>
+              <w:t>14.5  Load and Performance Testing</w:t>
             </w:r>
             <w:r>
               <w:rPr>
@@ -14978,7 +14978,7 @@
                 <w:rStyle w:val="Hyperlink"/>
                 <w:noProof/>
               </w:rPr>
-              <w:t>14.6  การตรวจสอบความเกี่ยวข้องตามข้อกำหนด (Test Matrix)</w:t>
+              <w:t>14.6  Requirements Traceability (Test Matrix)</w:t>
             </w:r>
             <w:r>
               <w:rPr>
@@ -15039,7 +15039,7 @@
                 <w:rStyle w:val="Hyperlink"/>
                 <w:noProof/>
               </w:rPr>
-              <w:t>14.7  สิ่งเข้า-ออกของคriteria</w:t>
+              <w:t>14.7  Entry and Exit Criteria</w:t>
             </w:r>
             <w:r>
               <w:rPr>
@@ -15100,7 +15100,7 @@
                 <w:rStyle w:val="Hyperlink"/>
                 <w:noProof/>
               </w:rPr>
-              <w:t>14.8  การจัดการผิดพลาด</w:t>
+              <w:t>14.8  Defect Management</w:t>
             </w:r>
             <w:r>
               <w:rPr>
@@ -15161,7 +15161,7 @@
                 <w:rStyle w:val="Hyperlink"/>
                 <w:noProof/>
               </w:rPr>
-              <w:t>15  การขยายตัวในอนาคต</w:t>
+              <w:t>15  Future Expansion</w:t>
             </w:r>
             <w:r>
               <w:rPr>
@@ -15222,7 +15222,7 @@
                 <w:rStyle w:val="Hyperlink"/>
                 <w:noProof/>
               </w:rPr>
-              <w:t>15.1  หลักฐานการปรับแต่งที่มีอยู่แล้ว</w:t>
+              <w:t>15.1  Extensibility Foundations Already in Place</w:t>
             </w:r>
             <w:r>
               <w:rPr>
@@ -15283,7 +15283,7 @@
                 <w:rStyle w:val="Hyperlink"/>
                 <w:noProof/>
               </w:rPr>
-              <w:t>15.2  การสนับสนุน ESP32</w:t>
+              <w:t>15.2  ESP32 Support</w:t>
             </w:r>
             <w:r>
               <w:rPr>
@@ -15344,7 +15344,7 @@
                 <w:rStyle w:val="Hyperlink"/>
                 <w:noProof/>
               </w:rPr>
-              <w:t>15.3  เซนเซอร์และการตรวจจับการใช้พลังงาน</w:t>
+              <w:t>15.3  Sensors and Energy Monitoring</w:t>
             </w:r>
             <w:r>
               <w:rPr>
@@ -15405,7 +15405,7 @@
                 <w:rStyle w:val="Hyperlink"/>
                 <w:noProof/>
               </w:rPr>
-              <w:t>15.4  การอัปเดต Firmware OTA</w:t>
+              <w:t>15.4  OTA Firmware Updates</w:t>
             </w:r>
             <w:r>
               <w:rPr>
@@ -15466,7 +15466,7 @@
                 <w:rStyle w:val="Hyperlink"/>
                 <w:noProof/>
               </w:rPr>
-              <w:t>15.5  การช่วยเหลือ AI สำหรับ automation</w:t>
+              <w:t>15.5  AI-Assisted Automation</w:t>
             </w:r>
             <w:r>
               <w:rPr>
@@ -15588,7 +15588,7 @@
                 <w:rStyle w:val="Hyperlink"/>
                 <w:noProof/>
               </w:rPr>
-              <w:t>15.7  การพัฒนาแอปพลิเคชันเคลื่อนที่ตามธรรมชาติ</w:t>
+              <w:t>15.7  Native Mobile Applications</w:t>
             </w:r>
             <w:r>
               <w:rPr>
@@ -15649,7 +15649,7 @@
                 <w:rStyle w:val="Hyperlink"/>
                 <w:noProof/>
               </w:rPr>
-              <w:t>15.8  การส่ง notification</w:t>
+              <w:t>15.8  Push Notifications</w:t>
             </w:r>
             <w:r>
               <w:rPr>
@@ -15710,7 +15710,7 @@
                 <w:rStyle w:val="Hyperlink"/>
                 <w:noProof/>
               </w:rPr>
-              <w:t>15.9  Multi-User และ Multi-Home</w:t>
+              <w:t>15.9  Multi-User and Multi-Home</w:t>
             </w:r>
             <w:r>
               <w:rPr>
@@ -15771,7 +15771,7 @@
                 <w:rStyle w:val="Hyperlink"/>
                 <w:noProof/>
               </w:rPr>
-              <w:t>15.10  สรุปการขยายตัว</w:t>
+              <w:t>15.10  Expansion Summary</w:t>
             </w:r>
             <w:r>
               <w:rPr>
@@ -15832,7 +15832,7 @@
                 <w:rStyle w:val="Hyperlink"/>
                 <w:noProof/>
               </w:rPr>
-              <w:t>16  บรรทัดฐานเพิ่มเติม</w:t>
+              <w:t>16  Appendices</w:t>
             </w:r>
             <w:r>
               <w:rPr>
@@ -15893,7 +15893,7 @@
                 <w:rStyle w:val="Hyperlink"/>
                 <w:noProof/>
               </w:rPr>
-              <w:t>บทบันทึก A  คำจำกัดความ</w:t>
+              <w:t>Appendix A  Glossary</w:t>
             </w:r>
             <w:r>
               <w:rPr>
@@ -15954,7 +15954,7 @@
                 <w:rStyle w:val="Hyperlink"/>
                 <w:noProof/>
               </w:rPr>
-              <w:t>บทบันทึก B  โครงสร้างความเกี่ยวข้องตามข้อกำหนด</w:t>
+              <w:t>Appendix B  Requirements Traceability Matrix</w:t>
             </w:r>
             <w:r>
               <w:rPr>
@@ -16015,7 +16015,7 @@
                 <w:rStyle w:val="Hyperlink"/>
                 <w:noProof/>
               </w:rPr>
-              <w:t>บทบันทึก C  การอ้างอิงการตั้งค่า</w:t>
+              <w:t>Appendix C  Configuration Reference</w:t>
             </w:r>
             <w:r>
               <w:rPr>
@@ -16076,7 +16076,7 @@
                 <w:rStyle w:val="Hyperlink"/>
                 <w:noProof/>
               </w:rPr>
-              <w:t>บทบันทึก D  ข้อกำหนดเอกสาร</w:t>
+              <w:t>Appendix D  Document Conventions</w:t>
             </w:r>
             <w:r>
               <w:rPr>
@@ -16137,7 +16137,7 @@
                 <w:rStyle w:val="Hyperlink"/>
                 <w:noProof/>
               </w:rPr>
-              <w:t>เอกสารเสริม E การตรวจสอบการยอมรับ</w:t>
+              <w:t>เอกสารเสริม E  ตรวจสอบความยอมรับ</w:t>
             </w:r>
             <w:r>
               <w:rPr>
@@ -16211,7 +16211,7 @@
       </w:pPr>
       <w:bookmarkStart w:id="4" w:name="_Toc233974873"/>
       <w:r>
-        <w:t>1  วัตถุประสงค์มาตรฐานการกำหนดค่าซอฟต์แวร์</w:t>
+        <w:t>1  วิธีการกำหนดมาตรฐานการออกแบบซอฟต์แวร์</w:t>
       </w:r>
       <w:bookmarkEnd w:id="4"/>
     </w:p>
@@ -16229,7 +16229,7 @@
         <w:t xml:space="preserve"> </w:t>
       </w:r>
       <w:r>
-        <w:t>บทนี้กำหนดวัตถุประสงค์และขอบเขตของแพลตฟอร์มควบคุมบ้านในความสัมพันธ์กับ ISO/IEC/IEEE 29148:2018 บทนี้กำหนดวัตถุประสงค์และขอบเขตของแพลตฟอร์มควบคุมบ้าน และกำหนดพฤติกรรมทางฟังก์ชันและคุณสมบัติที่ระบบที่ได้รับจะต้องปฏิบัติตาม โดยแต่ละความต้องการมีความเป็นเอกลักษณ์เดียว ส่วนตัว สามารถตรวจสอบ และสามารถเชื่อมโยงกับความต้องการของผู้มีส่วนได้ส่วนเสีย</w:t>
+        <w:t>บทนี้กำหนดมาตรฐานสำหรับแพลตฟอร์มควบคุมบ้านในความสัมพันธ์กับ ISO/IEC/IEEE 29148:2018 มีไว้เพื่อระบุวัตถุประสงค์ ความกว้างขอบเขต ระบบการเชื่อมต่อ พฤติกรรมทางปฏิบัติ และคุณสมบัติที่ดี ซึ่งระบบที่ได้รับจะต้องตรงตาม</w:t>
       </w:r>
     </w:p>
     <w:p>
@@ -16248,7 +16248,7 @@
         <w:jc w:val="both"/>
       </w:pPr>
       <w:r>
-        <w:t>วัตถุประสงค์ของเอกสารนี้คือการกำหนดและทำให้แน่ใจว่าแพลตฟอร์มควบคุมบ้านจะทำอะไรอย่างไรเพื่อให้ทีมงานด้านการออกแบบ การตรวจสอบคุณภาพ และผู้มีส่วนได้ส่วนเสียสามารถแบ่งปันฐานข้อมูลที่เหมือนกันได้ โดยใช้เป็นข้อกำหนดในการออกแบบ การพัฒนา การตรวจสอบ และการยอมรับ</w:t>
+        <w:t>วัตถุประสงค์ของเอกสารนี้คือเพื่อสร้างความชัดเจนและสมบูรณ์แบบเกี่ยวกับสิ่งที่แพลตฟอร์มควบคุมบ้านจะทำให้การออกแบบ การตรวจสอบคุณภาพ และผู้มีส่วนได้ส่วนเสียสามารถแบ่งปันฐานข้อมูลร่วมกันได้ นอกจากนี้ยังใช้เป็นข้อความที่เป็นตัวแทนในการตกลงการออกแบบ การพัฒนา การตรวจสอบ และการยอมรับ</w:t>
       </w:r>
     </w:p>
     <w:p>
@@ -16257,7 +16257,7 @@
       </w:pPr>
       <w:bookmarkStart w:id="6" w:name="_Toc233974875"/>
       <w:r>
-        <w:t>1.2  ขอบเขต</w:t>
+        <w:t>1.2  ความกว้างขอบเขต</w:t>
       </w:r>
       <w:bookmarkEnd w:id="6"/>
     </w:p>
@@ -16267,7 +16267,7 @@
         <w:jc w:val="both"/>
       </w:pPr>
       <w:r>
-        <w:t>แพลตฟอร์มควบคุมบ้านเป็นระบบอินเทอร์เน็ตของสิ่งแวดล้อมที่จัดหาสถานะกลางในการควบคุมเครื่องมือ ESP8266-พื้นฐาน</w:t>
+        <w:t>แพลตฟอร์มควบคุมบ้านคือระบบ Internet-of-Things ที่จัดการโดยตรงผ่านเครือข่ายกลาง โดยควบคุมอุปกรณ์ ESP8266-พื้นฐานทั้งหมดของอุปกรณ์รีเลย</w:t>
       </w:r>
     </w:p>
     <w:p>
@@ -16288,7 +16288,7 @@
         <w:spacing w:after="60" w:line="264" w:lineRule="auto"/>
       </w:pPr>
       <w:r>
-        <w:t>การยืนยันผู้ใช้และควบคุมเข้าถึงด้วยการแบ่งแยกระดับ</w:t>
+        <w:t>การเข้าสู่ระบบและการควบคุมความปลอดภัยด้วยการควบคุมบทบาท</w:t>
       </w:r>
     </w:p>
     <w:p>
@@ -16301,7 +16301,7 @@
         <w:spacing w:after="60" w:line="264" w:lineRule="auto"/>
       </w:pPr>
       <w:r>
-        <w:t>การจัดการชีวิตของอุปกรณ์ (การลงทะเบียน ชื่อ ห้อง การลบออก)</w:t>
+        <w:t>การจัดการชีวิตของอุปกรณ์ (การลงทะเบียน ชื่อ หมายเลขห้อง การลบออก)</w:t>
       </w:r>
     </w:p>
     <w:p>
@@ -16314,7 +16314,7 @@
         <w:spacing w:after="60" w:line="264" w:lineRule="auto"/>
       </w:pPr>
       <w:r>
-        <w:t>การควบคุมเรลโดยตรง (ON OFF TOGGLE) และการอ่านสถานะ</w:t>
+        <w:t>การควบคุมการทำงานแบบเรียลไทม์ (ON OFF TOGGLE) และการอ่านสถานะ</w:t>
       </w:r>
     </w:p>
     <w:p>
@@ -16327,7 +16327,7 @@
         <w:spacing w:after="60" w:line="264" w:lineRule="auto"/>
       </w:pPr>
       <w:r>
-        <w:t>สถานะความมีอยู่และข้อมูลส่งต่อ (ออนไลน์/ไม่ออนไลน์ RSSI รุ่นเฟิร์มแวร์สุดท้าย)</w:t>
+        <w:t>การแสดงตัวของอุปกรณ์อยู่เสมอและการส่งสัญญาณ (ออนไลน์/ไม่ออนไลน์ RSSI รุ่นฟirmware ส่วนสุดท้ายที่เคยเห็น)</w:t>
       </w:r>
     </w:p>
     <w:p>
@@ -16340,7 +16340,7 @@
         <w:spacing w:after="60" w:line="264" w:lineRule="auto"/>
       </w:pPr>
       <w:r>
-        <w:t>การควบคุมโดยใช้เวลา ชุดอุปกรณ์ และฉากมือ</w:t>
+        <w:t>การควบคุมโดยใช้เวลา ตัวช่วยจากเซ็นเซอร์ และภาพถ่ายมืออาชีพ</w:t>
       </w:r>
     </w:p>
     <w:p>
@@ -16353,7 +16353,7 @@
         <w:spacing w:after="60" w:line="264" w:lineRule="auto"/>
       </w:pPr>
       <w:r>
-        <w:t>การบันทึกกิจกรรมที่ไม่สามารถแก้ไขได้และบันทึกการตรวจสอบ</w:t>
+        <w:t>การบันทึกกิจกรรมอย่างไม่เปลี่ยนแปลงและบันทึกการตรวจสอบ</w:t>
       </w:r>
     </w:p>
     <w:p>
@@ -16366,7 +16366,7 @@
         <w:spacing w:after="60" w:line="264" w:lineRule="auto"/>
       </w:pPr>
       <w:r>
-        <w:t>เว็บดैशบอร์ดที่ตอบสนอง การกำหนดค่า API REST และการส่งข้อความอุปกรณ์ MQTT</w:t>
+        <w:t>เว็บดาสโตรพันช์ เว็บไซต์ API REST และการส่งข้อความ MQTT</w:t>
       </w:r>
     </w:p>
     <w:p>
@@ -16379,7 +16379,7 @@
         <w:spacing w:after="60" w:line="264" w:lineRule="auto"/>
       </w:pPr>
       <w:r>
-        <w:t>การขึ้นบรรจุภัณฑ์ภายในเครื่องมือรับ TLS-terminating reverse proxy</w:t>
+        <w:t>การขึ้นบรรทุกภายใต้ reverse proxy ที่ใช้ TLS</w:t>
       </w:r>
     </w:p>
     <w:p>
@@ -16387,7 +16387,7 @@
         <w:pStyle w:val="Heading4"/>
       </w:pPr>
       <w:r>
-        <w:t>ไม่ในวงจรนี้ (เพื่อนำไปใช้ใน Future Expansion)</w:t>
+        <w:t>ไม่ในวงกว้าง (ในส่วนนี้)</w:t>
       </w:r>
     </w:p>
     <w:p>
@@ -16400,7 +16400,7 @@
         <w:spacing w:after="60" w:line="264" w:lineRule="auto"/>
       </w:pPr>
       <w:r>
-        <w:t>แอปพลิเคชันบนมือถือที่เป็นเจ้าบ้าน / แยกความแตกต่างของการค่าใช้จ่ายหลังการใช้งาน</w:t>
+        <w:t>แอปพลิเคชันบนมือถือแบบดั้งเดิม (API REST/WebSocket จะให้ความสามารถในการทำได้ในอนาคต)</w:t>
       </w:r>
     </w:p>
     <w:p>
@@ -16413,7 +16413,7 @@
         <w:spacing w:after="60" w:line="264" w:lineRule="auto"/>
       </w:pPr>
       <w:r>
-        <w:t>การอัปเดตเฟิร์มแวร์ OTA (วางแผน; ดู Future Expansion)</w:t>
+        <w:t>การอัปเดตรูปแบบ firmware ที่จะดำเนินการภายหลัง (วางแผน; ดู Future Expansion)</w:t>
       </w:r>
     </w:p>
     <w:p>
@@ -16426,7 +16426,7 @@
         <w:spacing w:after="60" w:line="264" w:lineRule="auto"/>
       </w:pPr>
       <w:r>
-        <w:t>การเชื่อมต่อเสียงร้องผู้ช่วย (Alexa, Google Home)</w:t>
+        <w:t>การเชื่อมต่อกับแวสท์เสียงที่สาม (Alexa, Google Home)</w:t>
       </w:r>
     </w:p>
     <w:p>
@@ -16439,7 +16439,7 @@
         <w:spacing w:after="60" w:line="264" w:lineRule="auto"/>
       </w:pPr>
       <w:r>
-        <w:t>การจัดการค่าใช้จ่ายหลังการใช้งานและความเป็นส่วนตัวของอุปกรณ์</w:t>
+        <w:t>การจ่ายเงินและความเป็นส่วนตัวของบ้านหลายบ้าน / ที่มีแบ่งปันข้อมูลนอกเหนือจากเจ้าของอุปกรณ์แต่ละอัน</w:t>
       </w:r>
     </w:p>
     <w:p>
@@ -16448,7 +16448,7 @@
         <w:jc w:val="both"/>
       </w:pPr>
       <w:r>
-        <w:t>อย่างไรก็ตาม อาจจะออกแบบให้สามารถเพิ่มสิ่งที่ไม่อยู่ในวงจรนี้ได้ด้วยการเปลี่ยนแปลงรูปร่างโครงสร้างน้อยมาก ตามที่กล่าวไว้ในบท Future Expansion</w:t>
+        <w:t>อย่างไรก็ตาม อาจจะออกแบบให้สามารถเพิ่มส่วนนี้ได้ด้วยการเปลี่ยนแปลงรูปร่างที่เล็กน้อยตามที่กล่าวไว้ใน Future Expansion</w:t>
       </w:r>
     </w:p>
     <w:p>
@@ -16467,7 +16467,7 @@
       </w:pPr>
       <w:bookmarkStart w:id="8" w:name="_Toc233974877"/>
       <w:r>
-        <w:t>1.3.1  มุมมองของผู้ใช้งาน</w:t>
+        <w:t>1.3.1  ด้านมุมมองของผู้ใช้</w:t>
       </w:r>
       <w:bookmarkEnd w:id="8"/>
     </w:p>
@@ -16477,7 +16477,7 @@
         <w:jc w:val="both"/>
       </w:pPr>
       <w:r>
-        <w:t>แพลตฟอร์มควบคุมบ้านเป็นผลิตภัณฑ์ที่ใหม่และสามารถจัดการได้ด้วยตนเอง ไม่ใช่เป็นส่วนหนึ่งของระบบที่ใหญ่กว่า แพลตฟอร์มนี้ทำตามโครงสร้างลेयरของคลายเอนด์-เอดจ์-แอปพลิเคชัน-ส่งข้อความ-ข้อมูล-อุปกรณ์</w:t>
+        <w:t>แพลตฟอร์มควบคุมบ้านเป็นผลิตภัณฑ์ที่ใหม่และสามารถแบ่งออกเป็นส่วนประกอบได้ แทนที่จะเป็นส่วนหนึ่งของระบบที่ใหญ่กว่า มีการออกแบบตามโครงสร้างลेयरผู้ใช้-ขอบเขต-แอปพลิเคชัน-การส่งข้อความ-ข้อมูล-อุปกรณ์</w:t>
       </w:r>
       <w:proofErr w:type="spellStart"/>
       <w:r/>

</xml_diff>